<commit_message>
Calendario: solo se editan hoy y ayer, lo anterior es solo lectura
</commit_message>
<xml_diff>
--- a/DOCUMENTACION_ARQUITECTURA_COMPLETA.docx
+++ b/DOCUMENTACION_ARQUITECTURA_COMPLETA.docx
@@ -15,7 +15,17 @@
         <w:pStyle w:val="IntenseQuote"/>
       </w:pPr>
       <w:r>
-        <w:t xml:space="preserve">Última actualización: 2026-10-03 (Grupos: ranking y chat por grupo — </w:t>
+        <w:t xml:space="preserve">Última actualización: 2026-10-03 (Edición solo de hoy y ayer — </w:t>
+      </w:r>
+      <w:r>
+        <w:rPr>
+          <w:rFonts w:ascii="Consolas" w:hAnsi="Consolas"/>
+          <w:sz w:val="18"/>
+        </w:rPr>
+        <w:t>supabase/edicion_hoy_ayer.sql</w:t>
+      </w:r>
+      <w:r>
+        <w:t xml:space="preserve">; antes ese día, Grupos — </w:t>
       </w:r>
       <w:r>
         <w:rPr>
@@ -60,6 +70,23 @@
       </w:pPr>
       <w:r>
         <w:t>CHANGELOG</w:t>
+      </w:r>
+    </w:p>
+    <w:p>
+      <w:pPr>
+        <w:pStyle w:val="ListBullet"/>
+      </w:pPr>
+      <w:r>
+        <w:t xml:space="preserve">2026-10-03 — </w:t>
+      </w:r>
+      <w:r>
+        <w:rPr>
+          <w:b/>
+        </w:rPr>
+        <w:t>Edición solo hoy y ayer</w:t>
+      </w:r>
+      <w:r>
+        <w:t>: los hábitos (oficiales y personales) solo se tachan/destachan hoy o ayer; antes de ayer es de solo lectura. Aplica al panel del día, a la importación de Hevy y a la cola offline, y lo refuerza RLS. No cambia ningún dato ya guardado.</w:t>
       </w:r>
     </w:p>
     <w:p>
@@ -1048,7 +1075,21 @@
         <w:t>`grupos.sql`</w:t>
       </w:r>
       <w:r>
-        <w:t xml:space="preserve"> — grupos, admins, chat por grupo y migración a "WINTER ARC ORIGINAL". Correr al final. Se puede repetir.</w:t>
+        <w:t xml:space="preserve"> — grupos, admins, chat por grupo y migración a "WINTER ARC ORIGINAL". Se puede repetir.</w:t>
+      </w:r>
+    </w:p>
+    <w:p>
+      <w:pPr>
+        <w:pStyle w:val="ListNumber"/>
+      </w:pPr>
+      <w:r>
+        <w:rPr>
+          <w:b/>
+        </w:rPr>
+        <w:t>`edicion_hoy_ayer.sql`</w:t>
+      </w:r>
+      <w:r>
+        <w:t xml:space="preserve"> — reglas RLS de "solo hoy y ayer" (ver sección 7). Se puede repetir.</w:t>
       </w:r>
     </w:p>
     <w:p>
@@ -2095,7 +2136,323 @@
         <w:pStyle w:val="Heading1"/>
       </w:pPr>
       <w:r>
-        <w:t>7. Seguridad (resumen)</w:t>
+        <w:t>7. Ventana de edición: solo hoy y ayer</w:t>
+      </w:r>
+    </w:p>
+    <w:tbl>
+      <w:tblPr>
+        <w:tblStyle w:val="TableGrid"/>
+        <w:tblW w:type="auto" w:w="0"/>
+        <w:tblLook w:firstColumn="1" w:firstRow="1" w:lastColumn="0" w:lastRow="0" w:noHBand="0" w:noVBand="1" w:val="04A0"/>
+      </w:tblPr>
+      <w:tblGrid>
+        <w:gridCol w:w="4320"/>
+        <w:gridCol w:w="4320"/>
+      </w:tblGrid>
+      <w:tr>
+        <w:tc>
+          <w:tcPr>
+            <w:tcW w:type="dxa" w:w="4320"/>
+          </w:tcPr>
+          <w:p>
+            <w:r>
+              <w:rPr>
+                <w:b/>
+              </w:rPr>
+              <w:t>Día</w:t>
+            </w:r>
+          </w:p>
+        </w:tc>
+        <w:tc>
+          <w:tcPr>
+            <w:tcW w:type="dxa" w:w="4320"/>
+          </w:tcPr>
+          <w:p>
+            <w:r>
+              <w:rPr>
+                <w:b/>
+              </w:rPr>
+              <w:t>Qué se puede hacer</w:t>
+            </w:r>
+          </w:p>
+        </w:tc>
+      </w:tr>
+      <w:tr>
+        <w:tc>
+          <w:tcPr>
+            <w:tcW w:type="dxa" w:w="4320"/>
+          </w:tcPr>
+          <w:p>
+            <w:r>
+              <w:t>Futuro</w:t>
+            </w:r>
+          </w:p>
+        </w:tc>
+        <w:tc>
+          <w:tcPr>
+            <w:tcW w:type="dxa" w:w="4320"/>
+          </w:tcPr>
+          <w:p>
+            <w:r>
+              <w:t>Nada (bloqueado, como siempre)</w:t>
+            </w:r>
+          </w:p>
+        </w:tc>
+      </w:tr>
+      <w:tr>
+        <w:tc>
+          <w:tcPr>
+            <w:tcW w:type="dxa" w:w="4320"/>
+          </w:tcPr>
+          <w:p>
+            <w:r>
+              <w:t>Hoy y ayer</w:t>
+            </w:r>
+          </w:p>
+        </w:tc>
+        <w:tc>
+          <w:tcPr>
+            <w:tcW w:type="dxa" w:w="4320"/>
+          </w:tcPr>
+          <w:p>
+            <w:r>
+              <w:t>Tachar/destachar. Los hábitos con foto (</w:t>
+            </w:r>
+            <w:r>
+              <w:rPr>
+                <w:rFonts w:ascii="Consolas" w:hAnsi="Consolas"/>
+                <w:sz w:val="18"/>
+              </w:rPr>
+              <w:t>PHOTO_HABITS</w:t>
+            </w:r>
+            <w:r>
+              <w:t>) piden evidencia en ambos días</w:t>
+            </w:r>
+          </w:p>
+        </w:tc>
+      </w:tr>
+      <w:tr>
+        <w:tc>
+          <w:tcPr>
+            <w:tcW w:type="dxa" w:w="4320"/>
+          </w:tcPr>
+          <w:p>
+            <w:r>
+              <w:t>Antes de ayer</w:t>
+            </w:r>
+          </w:p>
+        </w:tc>
+        <w:tc>
+          <w:tcPr>
+            <w:tcW w:type="dxa" w:w="4320"/>
+          </w:tcPr>
+          <w:p>
+            <w:r>
+              <w:t>Solo lectura: se ve lo marcado y las fotos, con el aviso "Este día ya no se puede editar"</w:t>
+            </w:r>
+          </w:p>
+        </w:tc>
+      </w:tr>
+    </w:tbl>
+    <w:p>
+      <w:r>
+        <w:t>Dónde vive la regla:</w:t>
+      </w:r>
+    </w:p>
+    <w:p>
+      <w:pPr>
+        <w:pStyle w:val="ListBullet"/>
+      </w:pPr>
+      <w:r>
+        <w:rPr>
+          <w:rFonts w:ascii="Consolas" w:hAnsi="Consolas"/>
+          <w:sz w:val="18"/>
+        </w:rPr>
+        <w:t>isEditableDay(date, today)</w:t>
+      </w:r>
+      <w:r>
+        <w:t xml:space="preserve"> en </w:t>
+      </w:r>
+      <w:r>
+        <w:rPr>
+          <w:rFonts w:ascii="Consolas" w:hAnsi="Consolas"/>
+          <w:sz w:val="18"/>
+        </w:rPr>
+        <w:t>src/lib/dates.ts</w:t>
+      </w:r>
+      <w:r>
+        <w:t xml:space="preserve"> (hora de CDMX vía </w:t>
+      </w:r>
+      <w:r>
+        <w:rPr>
+          <w:rFonts w:ascii="Consolas" w:hAnsi="Consolas"/>
+          <w:sz w:val="18"/>
+        </w:rPr>
+        <w:t>todayMX()</w:t>
+      </w:r>
+      <w:r>
+        <w:t>).</w:t>
+      </w:r>
+    </w:p>
+    <w:p>
+      <w:pPr>
+        <w:pStyle w:val="ListBullet"/>
+      </w:pPr>
+      <w:r>
+        <w:rPr>
+          <w:rFonts w:ascii="Consolas" w:hAnsi="Consolas"/>
+          <w:sz w:val="18"/>
+        </w:rPr>
+        <w:t>DaySheet</w:t>
+      </w:r>
+      <w:r>
+        <w:t xml:space="preserve"> y </w:t>
+      </w:r>
+      <w:r>
+        <w:rPr>
+          <w:rFonts w:ascii="Consolas" w:hAnsi="Consolas"/>
+          <w:sz w:val="18"/>
+        </w:rPr>
+        <w:t>CustomHabitsSection</w:t>
+      </w:r>
+      <w:r>
+        <w:t>: casillas deshabilitadas (cursor normal, sin hover) y aviso con candado.</w:t>
+      </w:r>
+    </w:p>
+    <w:p>
+      <w:pPr>
+        <w:pStyle w:val="ListBullet"/>
+      </w:pPr>
+      <w:r>
+        <w:rPr>
+          <w:rFonts w:ascii="Consolas" w:hAnsi="Consolas"/>
+          <w:sz w:val="18"/>
+        </w:rPr>
+        <w:t>calendario/page.tsx</w:t>
+      </w:r>
+      <w:r>
+        <w:t xml:space="preserve"> → </w:t>
+      </w:r>
+      <w:r>
+        <w:rPr>
+          <w:rFonts w:ascii="Consolas" w:hAnsi="Consolas"/>
+          <w:sz w:val="18"/>
+        </w:rPr>
+        <w:t>onToggle</w:t>
+      </w:r>
+      <w:r>
+        <w:t xml:space="preserve"> ignora días cerrados; </w:t>
+      </w:r>
+      <w:r>
+        <w:rPr>
+          <w:rFonts w:ascii="Consolas" w:hAnsi="Consolas"/>
+          <w:sz w:val="18"/>
+        </w:rPr>
+        <w:t>HabitPhotoModal</w:t>
+      </w:r>
+      <w:r>
+        <w:t xml:space="preserve"> guarda la evidencia con la fecha del día que se tacha (hoy o ayer).</w:t>
+      </w:r>
+    </w:p>
+    <w:p>
+      <w:pPr>
+        <w:pStyle w:val="ListBullet"/>
+      </w:pPr>
+      <w:r>
+        <w:rPr>
+          <w:rFonts w:ascii="Consolas" w:hAnsi="Consolas"/>
+          <w:sz w:val="18"/>
+        </w:rPr>
+        <w:t>stats/Gym.tsx</w:t>
+      </w:r>
+      <w:r>
+        <w:t xml:space="preserve"> (importación de Hevy): los sets se guardan todos, pero "Ir al gym" solo se marca hoy/ayer.</w:t>
+      </w:r>
+    </w:p>
+    <w:p>
+      <w:pPr>
+        <w:pStyle w:val="ListBullet"/>
+      </w:pPr>
+      <w:r>
+        <w:rPr>
+          <w:rFonts w:ascii="Consolas" w:hAnsi="Consolas"/>
+          <w:sz w:val="18"/>
+        </w:rPr>
+        <w:t>useMyData.sync()</w:t>
+      </w:r>
+      <w:r>
+        <w:t>: si una acción offline quedó en cola hasta que su día se cerró, se descarta (si no, la base la rechazaría y atoraría la cola).</w:t>
+      </w:r>
+    </w:p>
+    <w:p>
+      <w:pPr>
+        <w:pStyle w:val="ListBullet"/>
+      </w:pPr>
+      <w:r>
+        <w:t>Base de datos (</w:t>
+      </w:r>
+      <w:r>
+        <w:rPr>
+          <w:rFonts w:ascii="Consolas" w:hAnsi="Consolas"/>
+          <w:sz w:val="18"/>
+        </w:rPr>
+        <w:t>edicion_hoy_ayer.sql</w:t>
+      </w:r>
+      <w:r>
+        <w:t xml:space="preserve">): función </w:t>
+      </w:r>
+      <w:r>
+        <w:rPr>
+          <w:rFonts w:ascii="Consolas" w:hAnsi="Consolas"/>
+          <w:sz w:val="18"/>
+        </w:rPr>
+        <w:t>is_editable_day(date)</w:t>
+      </w:r>
+      <w:r>
+        <w:t xml:space="preserve"> usada en las políticas de INSERT y DELETE de </w:t>
+      </w:r>
+      <w:r>
+        <w:rPr>
+          <w:rFonts w:ascii="Consolas" w:hAnsi="Consolas"/>
+          <w:sz w:val="18"/>
+        </w:rPr>
+        <w:t>habit_checks</w:t>
+      </w:r>
+      <w:r>
+        <w:t xml:space="preserve">, </w:t>
+      </w:r>
+      <w:r>
+        <w:rPr>
+          <w:rFonts w:ascii="Consolas" w:hAnsi="Consolas"/>
+          <w:sz w:val="18"/>
+        </w:rPr>
+        <w:t>habit_evidence</w:t>
+      </w:r>
+      <w:r>
+        <w:t xml:space="preserve"> y </w:t>
+      </w:r>
+      <w:r>
+        <w:rPr>
+          <w:rFonts w:ascii="Consolas" w:hAnsi="Consolas"/>
+          <w:sz w:val="18"/>
+        </w:rPr>
+        <w:t>custom_habit_checks</w:t>
+      </w:r>
+      <w:r>
+        <w:t>.</w:t>
+      </w:r>
+    </w:p>
+    <w:p>
+      <w:r>
+        <w:t>No aplica a los bonus (libro, medio maratón), que tienen sus propias reglas de fecha.</w:t>
+      </w:r>
+    </w:p>
+    <w:p>
+      <w:pPr>
+        <w:pStyle w:val="Heading1"/>
+      </w:pPr>
+      <w:r>
+        <w:t>8. Seguridad (resumen)</w:t>
       </w:r>
     </w:p>
     <w:p>
@@ -2177,7 +2534,7 @@
         <w:pStyle w:val="Heading1"/>
       </w:pPr>
       <w:r>
-        <w:t>8. Cómo correr</w:t>
+        <w:t>9. Cómo correr</w:t>
       </w:r>
     </w:p>
     <w:p>

</xml_diff>

<commit_message>
Habito nuevo Dieta (10mo) con requisito de foto y racha 8/10 desde hoy
</commit_message>
<xml_diff>
--- a/DOCUMENTACION_ARQUITECTURA_COMPLETA.docx
+++ b/DOCUMENTACION_ARQUITECTURA_COMPLETA.docx
@@ -15,7 +15,17 @@
         <w:pStyle w:val="IntenseQuote"/>
       </w:pPr>
       <w:r>
-        <w:t xml:space="preserve">Última actualización: 2026-10-03 (Edición solo de hoy y ayer — </w:t>
+        <w:t xml:space="preserve">Última actualización: 2026-10-03 (Hábito "Dieta" — </w:t>
+      </w:r>
+      <w:r>
+        <w:rPr>
+          <w:rFonts w:ascii="Consolas" w:hAnsi="Consolas"/>
+          <w:sz w:val="18"/>
+        </w:rPr>
+        <w:t>supabase/dieta.sql</w:t>
+      </w:r>
+      <w:r>
+        <w:t xml:space="preserve">; antes ese día, edición solo de hoy y ayer — </w:t>
       </w:r>
       <w:r>
         <w:rPr>
@@ -70,6 +80,43 @@
       </w:pPr>
       <w:r>
         <w:t>CHANGELOG</w:t>
+      </w:r>
+    </w:p>
+    <w:p>
+      <w:pPr>
+        <w:pStyle w:val="ListBullet"/>
+      </w:pPr>
+      <w:r>
+        <w:t xml:space="preserve">2026-10-03 — </w:t>
+      </w:r>
+      <w:r>
+        <w:rPr>
+          <w:b/>
+        </w:rPr>
+        <w:t>Hábito nuevo "Dieta"</w:t>
+      </w:r>
+      <w:r>
+        <w:t xml:space="preserve"> (10mo, key </w:t>
+      </w:r>
+      <w:r>
+        <w:rPr>
+          <w:rFonts w:ascii="Consolas" w:hAnsi="Consolas"/>
+          <w:sz w:val="18"/>
+        </w:rPr>
+        <w:t>dieta</w:t>
+      </w:r>
+      <w:r>
+        <w:t xml:space="preserve">, ícono </w:t>
+      </w:r>
+      <w:r>
+        <w:rPr>
+          <w:rFonts w:ascii="Consolas" w:hAnsi="Consolas"/>
+          <w:sz w:val="18"/>
+        </w:rPr>
+        <w:t>Salad</w:t>
+      </w:r>
+      <w:r>
+        <w:t>, pide foto). Máximo diario 10 y racha 8/10 desde el 2026-10-03; los días anteriores siguen con 9 y 7/9. Anuncio "🥗 X cuidó su dieta" en el chat.</w:t>
       </w:r>
     </w:p>
     <w:p>
@@ -1094,6 +1141,20 @@
     </w:p>
     <w:p>
       <w:pPr>
+        <w:pStyle w:val="ListNumber"/>
+      </w:pPr>
+      <w:r>
+        <w:rPr>
+          <w:b/>
+        </w:rPr>
+        <w:t>`dieta.sql`</w:t>
+      </w:r>
+      <w:r>
+        <w:t xml:space="preserve"> — agrega "dieta" al anuncio automático de evidencia (ver sección 8). Se puede repetir.</w:t>
+      </w:r>
+    </w:p>
+    <w:p>
+      <w:pPr>
         <w:pStyle w:val="Heading1"/>
       </w:pPr>
       <w:r>
@@ -2452,7 +2513,594 @@
         <w:pStyle w:val="Heading1"/>
       </w:pPr>
       <w:r>
-        <w:t>8. Seguridad (resumen)</w:t>
+        <w:t>8. Hábitos</w:t>
+      </w:r>
+    </w:p>
+    <w:p>
+      <w:r>
+        <w:t xml:space="preserve">Se definen en </w:t>
+      </w:r>
+      <w:r>
+        <w:rPr>
+          <w:rFonts w:ascii="Consolas" w:hAnsi="Consolas"/>
+          <w:sz w:val="18"/>
+        </w:rPr>
+        <w:t>HABITS</w:t>
+      </w:r>
+      <w:r>
+        <w:t xml:space="preserve"> (</w:t>
+      </w:r>
+      <w:r>
+        <w:rPr>
+          <w:rFonts w:ascii="Consolas" w:hAnsi="Consolas"/>
+          <w:sz w:val="18"/>
+        </w:rPr>
+        <w:t>src/lib/constants.ts</w:t>
+      </w:r>
+      <w:r>
+        <w:t xml:space="preserve">); la </w:t>
+      </w:r>
+      <w:r>
+        <w:rPr>
+          <w:rFonts w:ascii="Consolas" w:hAnsi="Consolas"/>
+          <w:sz w:val="18"/>
+        </w:rPr>
+        <w:t>key</w:t>
+      </w:r>
+      <w:r>
+        <w:t xml:space="preserve"> es lo que se guarda en </w:t>
+      </w:r>
+      <w:r>
+        <w:rPr>
+          <w:rFonts w:ascii="Consolas" w:hAnsi="Consolas"/>
+          <w:sz w:val="18"/>
+        </w:rPr>
+        <w:t>habit_checks</w:t>
+      </w:r>
+      <w:r>
+        <w:t xml:space="preserve"> y nunca debe cambiar. </w:t>
+      </w:r>
+      <w:r>
+        <w:rPr>
+          <w:rFonts w:ascii="Consolas" w:hAnsi="Consolas"/>
+          <w:sz w:val="18"/>
+        </w:rPr>
+        <w:t>habit_checks</w:t>
+      </w:r>
+      <w:r>
+        <w:t xml:space="preserve"> no tiene lista de keys permitidas, así que un hábito nuevo no necesita migración de tablas.</w:t>
+      </w:r>
+    </w:p>
+    <w:tbl>
+      <w:tblPr>
+        <w:tblStyle w:val="TableGrid"/>
+        <w:tblW w:type="auto" w:w="0"/>
+        <w:tblLook w:firstColumn="1" w:firstRow="1" w:lastColumn="0" w:lastRow="0" w:noHBand="0" w:noVBand="1" w:val="04A0"/>
+      </w:tblPr>
+      <w:tblGrid>
+        <w:gridCol w:w="2160"/>
+        <w:gridCol w:w="2160"/>
+        <w:gridCol w:w="2160"/>
+        <w:gridCol w:w="2160"/>
+      </w:tblGrid>
+      <w:tr>
+        <w:tc>
+          <w:tcPr>
+            <w:tcW w:type="dxa" w:w="2160"/>
+          </w:tcPr>
+          <w:p>
+            <w:r>
+              <w:rPr>
+                <w:b/>
+              </w:rPr>
+              <w:t>#</w:t>
+            </w:r>
+          </w:p>
+        </w:tc>
+        <w:tc>
+          <w:tcPr>
+            <w:tcW w:type="dxa" w:w="2160"/>
+          </w:tcPr>
+          <w:p>
+            <w:r>
+              <w:rPr>
+                <w:b/>
+              </w:rPr>
+              <w:t>key</w:t>
+            </w:r>
+          </w:p>
+        </w:tc>
+        <w:tc>
+          <w:tcPr>
+            <w:tcW w:type="dxa" w:w="2160"/>
+          </w:tcPr>
+          <w:p>
+            <w:r>
+              <w:rPr>
+                <w:b/>
+              </w:rPr>
+              <w:t>Hábito</w:t>
+            </w:r>
+          </w:p>
+        </w:tc>
+        <w:tc>
+          <w:tcPr>
+            <w:tcW w:type="dxa" w:w="2160"/>
+          </w:tcPr>
+          <w:p>
+            <w:r>
+              <w:rPr>
+                <w:b/>
+              </w:rPr>
+              <w:t>Foto</w:t>
+            </w:r>
+          </w:p>
+        </w:tc>
+      </w:tr>
+      <w:tr>
+        <w:tc>
+          <w:tcPr>
+            <w:tcW w:type="dxa" w:w="2160"/>
+          </w:tcPr>
+          <w:p>
+            <w:r>
+              <w:t>1</w:t>
+            </w:r>
+          </w:p>
+        </w:tc>
+        <w:tc>
+          <w:tcPr>
+            <w:tcW w:type="dxa" w:w="2160"/>
+          </w:tcPr>
+          <w:p>
+            <w:r>
+              <w:rPr>
+                <w:rFonts w:ascii="Consolas" w:hAnsi="Consolas"/>
+                <w:sz w:val="18"/>
+              </w:rPr>
+              <w:t>gym</w:t>
+            </w:r>
+          </w:p>
+        </w:tc>
+        <w:tc>
+          <w:tcPr>
+            <w:tcW w:type="dxa" w:w="2160"/>
+          </w:tcPr>
+          <w:p>
+            <w:r>
+              <w:t>Ir al gym</w:t>
+            </w:r>
+          </w:p>
+        </w:tc>
+        <w:tc>
+          <w:tcPr>
+            <w:tcW w:type="dxa" w:w="2160"/>
+          </w:tcPr>
+          <w:p>
+            <w:r>
+              <w:t>Sí</w:t>
+            </w:r>
+          </w:p>
+        </w:tc>
+      </w:tr>
+      <w:tr>
+        <w:tc>
+          <w:tcPr>
+            <w:tcW w:type="dxa" w:w="2160"/>
+          </w:tcPr>
+          <w:p>
+            <w:r>
+              <w:t>2</w:t>
+            </w:r>
+          </w:p>
+        </w:tc>
+        <w:tc>
+          <w:tcPr>
+            <w:tcW w:type="dxa" w:w="2160"/>
+          </w:tcPr>
+          <w:p>
+            <w:r>
+              <w:rPr>
+                <w:rFonts w:ascii="Consolas" w:hAnsi="Consolas"/>
+                <w:sz w:val="18"/>
+              </w:rPr>
+              <w:t>cardio</w:t>
+            </w:r>
+          </w:p>
+        </w:tc>
+        <w:tc>
+          <w:tcPr>
+            <w:tcW w:type="dxa" w:w="2160"/>
+          </w:tcPr>
+          <w:p>
+            <w:r>
+              <w:t>Cardio</w:t>
+            </w:r>
+          </w:p>
+        </w:tc>
+        <w:tc>
+          <w:tcPr>
+            <w:tcW w:type="dxa" w:w="2160"/>
+          </w:tcPr>
+          <w:p>
+            <w:r>
+              <w:t>Sí</w:t>
+            </w:r>
+          </w:p>
+        </w:tc>
+      </w:tr>
+      <w:tr>
+        <w:tc>
+          <w:tcPr>
+            <w:tcW w:type="dxa" w:w="2160"/>
+          </w:tcPr>
+          <w:p>
+            <w:r>
+              <w:t>3</w:t>
+            </w:r>
+          </w:p>
+        </w:tc>
+        <w:tc>
+          <w:tcPr>
+            <w:tcW w:type="dxa" w:w="2160"/>
+          </w:tcPr>
+          <w:p>
+            <w:r>
+              <w:rPr>
+                <w:rFonts w:ascii="Consolas" w:hAnsi="Consolas"/>
+                <w:sz w:val="18"/>
+              </w:rPr>
+              <w:t>leer</w:t>
+            </w:r>
+          </w:p>
+        </w:tc>
+        <w:tc>
+          <w:tcPr>
+            <w:tcW w:type="dxa" w:w="2160"/>
+          </w:tcPr>
+          <w:p>
+            <w:r>
+              <w:t>Leer 5 páginas</w:t>
+            </w:r>
+          </w:p>
+        </w:tc>
+        <w:tc>
+          <w:tcPr>
+            <w:tcW w:type="dxa" w:w="2160"/>
+          </w:tcPr>
+          <w:p>
+            <w:r>
+              <w:t>Sí</w:t>
+            </w:r>
+          </w:p>
+        </w:tc>
+      </w:tr>
+      <w:tr>
+        <w:tc>
+          <w:tcPr>
+            <w:tcW w:type="dxa" w:w="2160"/>
+          </w:tcPr>
+          <w:p>
+            <w:r>
+              <w:t>4</w:t>
+            </w:r>
+          </w:p>
+        </w:tc>
+        <w:tc>
+          <w:tcPr>
+            <w:tcW w:type="dxa" w:w="2160"/>
+          </w:tcPr>
+          <w:p>
+            <w:r>
+              <w:rPr>
+                <w:rFonts w:ascii="Consolas" w:hAnsi="Consolas"/>
+                <w:sz w:val="18"/>
+              </w:rPr>
+              <w:t>dormir</w:t>
+            </w:r>
+          </w:p>
+        </w:tc>
+        <w:tc>
+          <w:tcPr>
+            <w:tcW w:type="dxa" w:w="2160"/>
+          </w:tcPr>
+          <w:p>
+            <w:r>
+              <w:t>Dormir 7 horas</w:t>
+            </w:r>
+          </w:p>
+        </w:tc>
+        <w:tc>
+          <w:tcPr>
+            <w:tcW w:type="dxa" w:w="2160"/>
+          </w:tcPr>
+          <w:p>
+            <w:r>
+              <w:t>No</w:t>
+            </w:r>
+          </w:p>
+        </w:tc>
+      </w:tr>
+      <w:tr>
+        <w:tc>
+          <w:tcPr>
+            <w:tcW w:type="dxa" w:w="2160"/>
+          </w:tcPr>
+          <w:p>
+            <w:r>
+              <w:t>5</w:t>
+            </w:r>
+          </w:p>
+        </w:tc>
+        <w:tc>
+          <w:tcPr>
+            <w:tcW w:type="dxa" w:w="2160"/>
+          </w:tcPr>
+          <w:p>
+            <w:r>
+              <w:rPr>
+                <w:rFonts w:ascii="Consolas" w:hAnsi="Consolas"/>
+                <w:sz w:val="18"/>
+              </w:rPr>
+              <w:t>pasos</w:t>
+            </w:r>
+          </w:p>
+        </w:tc>
+        <w:tc>
+          <w:tcPr>
+            <w:tcW w:type="dxa" w:w="2160"/>
+          </w:tcPr>
+          <w:p>
+            <w:r>
+              <w:t>10,000 pasos</w:t>
+            </w:r>
+          </w:p>
+        </w:tc>
+        <w:tc>
+          <w:tcPr>
+            <w:tcW w:type="dxa" w:w="2160"/>
+          </w:tcPr>
+          <w:p>
+            <w:r>
+              <w:t>Sí</w:t>
+            </w:r>
+          </w:p>
+        </w:tc>
+      </w:tr>
+      <w:tr>
+        <w:tc>
+          <w:tcPr>
+            <w:tcW w:type="dxa" w:w="2160"/>
+          </w:tcPr>
+          <w:p>
+            <w:r>
+              <w:t>6</w:t>
+            </w:r>
+          </w:p>
+        </w:tc>
+        <w:tc>
+          <w:tcPr>
+            <w:tcW w:type="dxa" w:w="2160"/>
+          </w:tcPr>
+          <w:p>
+            <w:r>
+              <w:rPr>
+                <w:rFonts w:ascii="Consolas" w:hAnsi="Consolas"/>
+                <w:sz w:val="18"/>
+              </w:rPr>
+              <w:t>pantalla</w:t>
+            </w:r>
+          </w:p>
+        </w:tc>
+        <w:tc>
+          <w:tcPr>
+            <w:tcW w:type="dxa" w:w="2160"/>
+          </w:tcPr>
+          <w:p>
+            <w:r>
+              <w:t>Menos de 5 hrs de pantalla</w:t>
+            </w:r>
+          </w:p>
+        </w:tc>
+        <w:tc>
+          <w:tcPr>
+            <w:tcW w:type="dxa" w:w="2160"/>
+          </w:tcPr>
+          <w:p>
+            <w:r>
+              <w:t>Sí (captura de Tiempo de Uso)</w:t>
+            </w:r>
+          </w:p>
+        </w:tc>
+      </w:tr>
+      <w:tr>
+        <w:tc>
+          <w:tcPr>
+            <w:tcW w:type="dxa" w:w="2160"/>
+          </w:tcPr>
+          <w:p>
+            <w:r>
+              <w:t>7</w:t>
+            </w:r>
+          </w:p>
+        </w:tc>
+        <w:tc>
+          <w:tcPr>
+            <w:tcW w:type="dxa" w:w="2160"/>
+          </w:tcPr>
+          <w:p>
+            <w:r>
+              <w:rPr>
+                <w:rFonts w:ascii="Consolas" w:hAnsi="Consolas"/>
+                <w:sz w:val="18"/>
+              </w:rPr>
+              <w:t>proyecto</w:t>
+            </w:r>
+          </w:p>
+        </w:tc>
+        <w:tc>
+          <w:tcPr>
+            <w:tcW w:type="dxa" w:w="2160"/>
+          </w:tcPr>
+          <w:p>
+            <w:r>
+              <w:t>1 hr de proyecto personal</w:t>
+            </w:r>
+          </w:p>
+        </w:tc>
+        <w:tc>
+          <w:tcPr>
+            <w:tcW w:type="dxa" w:w="2160"/>
+          </w:tcPr>
+          <w:p>
+            <w:r>
+              <w:t>No</w:t>
+            </w:r>
+          </w:p>
+        </w:tc>
+      </w:tr>
+      <w:tr>
+        <w:tc>
+          <w:tcPr>
+            <w:tcW w:type="dxa" w:w="2160"/>
+          </w:tcPr>
+          <w:p>
+            <w:r>
+              <w:t>8</w:t>
+            </w:r>
+          </w:p>
+        </w:tc>
+        <w:tc>
+          <w:tcPr>
+            <w:tcW w:type="dxa" w:w="2160"/>
+          </w:tcPr>
+          <w:p>
+            <w:r>
+              <w:rPr>
+                <w:rFonts w:ascii="Consolas" w:hAnsi="Consolas"/>
+                <w:sz w:val="18"/>
+              </w:rPr>
+              <w:t>no_pajiza</w:t>
+            </w:r>
+          </w:p>
+        </w:tc>
+        <w:tc>
+          <w:tcPr>
+            <w:tcW w:type="dxa" w:w="2160"/>
+          </w:tcPr>
+          <w:p>
+            <w:r>
+              <w:t>No chaketa</w:t>
+            </w:r>
+          </w:p>
+        </w:tc>
+        <w:tc>
+          <w:tcPr>
+            <w:tcW w:type="dxa" w:w="2160"/>
+          </w:tcPr>
+          <w:p>
+            <w:r>
+              <w:t>No</w:t>
+            </w:r>
+          </w:p>
+        </w:tc>
+      </w:tr>
+      <w:tr>
+        <w:tc>
+          <w:tcPr>
+            <w:tcW w:type="dxa" w:w="2160"/>
+          </w:tcPr>
+          <w:p>
+            <w:r>
+              <w:t>9</w:t>
+            </w:r>
+          </w:p>
+        </w:tc>
+        <w:tc>
+          <w:tcPr>
+            <w:tcW w:type="dxa" w:w="2160"/>
+          </w:tcPr>
+          <w:p>
+            <w:r>
+              <w:rPr>
+                <w:rFonts w:ascii="Consolas" w:hAnsi="Consolas"/>
+                <w:sz w:val="18"/>
+              </w:rPr>
+              <w:t>agua_3litros</w:t>
+            </w:r>
+          </w:p>
+        </w:tc>
+        <w:tc>
+          <w:tcPr>
+            <w:tcW w:type="dxa" w:w="2160"/>
+          </w:tcPr>
+          <w:p>
+            <w:r>
+              <w:t>3 litros de agua</w:t>
+            </w:r>
+          </w:p>
+        </w:tc>
+        <w:tc>
+          <w:tcPr>
+            <w:tcW w:type="dxa" w:w="2160"/>
+          </w:tcPr>
+          <w:p>
+            <w:r>
+              <w:t>No</w:t>
+            </w:r>
+          </w:p>
+        </w:tc>
+      </w:tr>
+      <w:tr>
+        <w:tc>
+          <w:tcPr>
+            <w:tcW w:type="dxa" w:w="2160"/>
+          </w:tcPr>
+          <w:p>
+            <w:r>
+              <w:t>10</w:t>
+            </w:r>
+          </w:p>
+        </w:tc>
+        <w:tc>
+          <w:tcPr>
+            <w:tcW w:type="dxa" w:w="2160"/>
+          </w:tcPr>
+          <w:p>
+            <w:r>
+              <w:rPr>
+                <w:rFonts w:ascii="Consolas" w:hAnsi="Consolas"/>
+                <w:sz w:val="18"/>
+              </w:rPr>
+              <w:t>dieta</w:t>
+            </w:r>
+          </w:p>
+        </w:tc>
+        <w:tc>
+          <w:tcPr>
+            <w:tcW w:type="dxa" w:w="2160"/>
+          </w:tcPr>
+          <w:p>
+            <w:r>
+              <w:t>Dieta (desde 2026-10-03)</w:t>
+            </w:r>
+          </w:p>
+        </w:tc>
+        <w:tc>
+          <w:tcPr>
+            <w:tcW w:type="dxa" w:w="2160"/>
+          </w:tcPr>
+          <w:p>
+            <w:r>
+              <w:t>Sí (macros o una comida)</w:t>
+            </w:r>
+          </w:p>
+        </w:tc>
+      </w:tr>
+    </w:tbl>
+    <w:p>
+      <w:r>
+        <w:t>Hábitos agregados con la carrera ya empezada:</w:t>
       </w:r>
     </w:p>
     <w:p>
@@ -2460,6 +3108,213 @@
         <w:pStyle w:val="ListBullet"/>
       </w:pPr>
       <w:r>
+        <w:rPr>
+          <w:rFonts w:ascii="Consolas" w:hAnsi="Consolas"/>
+          <w:sz w:val="18"/>
+        </w:rPr>
+        <w:t>HABIT_SINCE</w:t>
+      </w:r>
+      <w:r>
+        <w:t xml:space="preserve"> (constants.ts) guarda la fecha de inicio de cada hábito nuevo (</w:t>
+      </w:r>
+      <w:r>
+        <w:rPr>
+          <w:rFonts w:ascii="Consolas" w:hAnsi="Consolas"/>
+          <w:sz w:val="18"/>
+        </w:rPr>
+        <w:t>dieta: "2026-10-03"</w:t>
+      </w:r>
+      <w:r>
+        <w:t>).</w:t>
+      </w:r>
+    </w:p>
+    <w:p>
+      <w:pPr>
+        <w:pStyle w:val="ListBullet"/>
+      </w:pPr>
+      <w:r>
+        <w:rPr>
+          <w:rFonts w:ascii="Consolas" w:hAnsi="Consolas"/>
+          <w:sz w:val="18"/>
+        </w:rPr>
+        <w:t>habitsOn(date)</w:t>
+      </w:r>
+      <w:r>
+        <w:t xml:space="preserve"> / </w:t>
+      </w:r>
+      <w:r>
+        <w:rPr>
+          <w:rFonts w:ascii="Consolas" w:hAnsi="Consolas"/>
+          <w:sz w:val="18"/>
+        </w:rPr>
+        <w:t>maxOn(date)</w:t>
+      </w:r>
+      <w:r>
+        <w:t xml:space="preserve"> (points.ts) dan los hábitos y el máximo de ese día: 9 antes de Dieta, 10 después. Los usan los anillos del calendario y del perfil, el panel del día, el mapa de calor, el % de cumplimiento y "Puntos de hoy".</w:t>
+      </w:r>
+    </w:p>
+    <w:p>
+      <w:pPr>
+        <w:pStyle w:val="ListBullet"/>
+      </w:pPr>
+      <w:r>
+        <w:t>Cumplimiento por hábito: el % de Dieta se calcula solo con los días desde que existe.</w:t>
+      </w:r>
+    </w:p>
+    <w:p>
+      <w:pPr>
+        <w:pStyle w:val="ListBullet"/>
+      </w:pPr>
+      <w:r>
+        <w:t xml:space="preserve">Racha: </w:t>
+      </w:r>
+      <w:r>
+        <w:rPr>
+          <w:rFonts w:ascii="Consolas" w:hAnsi="Consolas"/>
+          <w:sz w:val="18"/>
+        </w:rPr>
+        <w:t>streakMinOn(date)</w:t>
+      </w:r>
+      <w:r>
+        <w:t xml:space="preserve"> → 7 antes de Dieta (</w:t>
+      </w:r>
+      <w:r>
+        <w:rPr>
+          <w:rFonts w:ascii="Consolas" w:hAnsi="Consolas"/>
+          <w:sz w:val="18"/>
+        </w:rPr>
+        <w:t>STREAK_MIN_HABITS_BEFORE_DIETA</w:t>
+      </w:r>
+      <w:r>
+        <w:t>), 8 desde entonces (</w:t>
+      </w:r>
+      <w:r>
+        <w:rPr>
+          <w:rFonts w:ascii="Consolas" w:hAnsi="Consolas"/>
+          <w:sz w:val="18"/>
+        </w:rPr>
+        <w:t>STREAK_MIN_HABITS</w:t>
+      </w:r>
+      <w:r>
+        <w:t>). Es la misma proporción (~78%, redondeada hacia arriba), y así nadie pierde la racha que ya llevaba.</w:t>
+      </w:r>
+    </w:p>
+    <w:p>
+      <w:pPr>
+        <w:pStyle w:val="ListBullet"/>
+      </w:pPr>
+      <w:r>
+        <w:t xml:space="preserve">Los puntos no cambian: cada hábito marcado vale 1, igual en la app y en la vista </w:t>
+      </w:r>
+      <w:r>
+        <w:rPr>
+          <w:rFonts w:ascii="Consolas" w:hAnsi="Consolas"/>
+          <w:sz w:val="18"/>
+        </w:rPr>
+        <w:t>leaderboard</w:t>
+      </w:r>
+      <w:r>
+        <w:t>.</w:t>
+      </w:r>
+    </w:p>
+    <w:p>
+      <w:r>
+        <w:t xml:space="preserve">Para agregar otro hábito con foto: entrada al final de </w:t>
+      </w:r>
+      <w:r>
+        <w:rPr>
+          <w:rFonts w:ascii="Consolas" w:hAnsi="Consolas"/>
+          <w:sz w:val="18"/>
+        </w:rPr>
+        <w:t>HABITS</w:t>
+      </w:r>
+      <w:r>
+        <w:t xml:space="preserve">, su fecha en </w:t>
+      </w:r>
+      <w:r>
+        <w:rPr>
+          <w:rFonts w:ascii="Consolas" w:hAnsi="Consolas"/>
+          <w:sz w:val="18"/>
+        </w:rPr>
+        <w:t>HABIT_SINCE</w:t>
+      </w:r>
+      <w:r>
+        <w:t xml:space="preserve">, ícono en </w:t>
+      </w:r>
+      <w:r>
+        <w:rPr>
+          <w:rFonts w:ascii="Consolas" w:hAnsi="Consolas"/>
+          <w:sz w:val="18"/>
+        </w:rPr>
+        <w:t>HabitIcon.tsx</w:t>
+      </w:r>
+      <w:r>
+        <w:t xml:space="preserve">, key en </w:t>
+      </w:r>
+      <w:r>
+        <w:rPr>
+          <w:rFonts w:ascii="Consolas" w:hAnsi="Consolas"/>
+          <w:sz w:val="18"/>
+        </w:rPr>
+        <w:t>PHOTO_HABITS</w:t>
+      </w:r>
+      <w:r>
+        <w:t xml:space="preserve">, texto en </w:t>
+      </w:r>
+      <w:r>
+        <w:rPr>
+          <w:rFonts w:ascii="Consolas" w:hAnsi="Consolas"/>
+          <w:sz w:val="18"/>
+        </w:rPr>
+        <w:t>HabitPhotoModal.tsx</w:t>
+      </w:r>
+      <w:r>
+        <w:t xml:space="preserve">, emoji→ícono en </w:t>
+      </w:r>
+      <w:r>
+        <w:rPr>
+          <w:rFonts w:ascii="Consolas" w:hAnsi="Consolas"/>
+          <w:sz w:val="18"/>
+        </w:rPr>
+        <w:t>SYSTEM_ICONS</w:t>
+      </w:r>
+      <w:r>
+        <w:t xml:space="preserve"> del chat y un </w:t>
+      </w:r>
+      <w:r>
+        <w:rPr>
+          <w:rFonts w:ascii="Consolas" w:hAnsi="Consolas"/>
+          <w:sz w:val="18"/>
+        </w:rPr>
+        <w:t>when</w:t>
+      </w:r>
+      <w:r>
+        <w:t xml:space="preserve"> en </w:t>
+      </w:r>
+      <w:r>
+        <w:rPr>
+          <w:rFonts w:ascii="Consolas" w:hAnsi="Consolas"/>
+          <w:sz w:val="18"/>
+        </w:rPr>
+        <w:t>announce_habit_evidence()</w:t>
+      </w:r>
+      <w:r>
+        <w:t xml:space="preserve"> (SQL). Si cambia el máximo, ajustar la racha con una regla por fecha como la de Dieta.</w:t>
+      </w:r>
+    </w:p>
+    <w:p>
+      <w:pPr>
+        <w:pStyle w:val="Heading1"/>
+      </w:pPr>
+      <w:r>
+        <w:t>9. Seguridad (resumen)</w:t>
+      </w:r>
+    </w:p>
+    <w:p>
+      <w:pPr>
+        <w:pStyle w:val="ListBullet"/>
+      </w:pPr>
+      <w:r>
         <w:t xml:space="preserve">RLS en todas las tablas. Escrituras sensibles (puntos del casino, apuestas, ajedrez, grupos) solo por funciones </w:t>
       </w:r>
       <w:r>
@@ -2534,7 +3389,7 @@
         <w:pStyle w:val="Heading1"/>
       </w:pPr>
       <w:r>
-        <w:t>9. Cómo correr</w:t>
+        <w:t>10. Cómo correr</w:t>
       </w:r>
     </w:p>
     <w:p>

</xml_diff>

<commit_message>
Blindaje del casino: rondas con tope de premio, quiebra real para comprar peseis, cobro antes de repartir en blackjack, limite de velocidad y auditoria
</commit_message>
<xml_diff>
--- a/DOCUMENTACION_ARQUITECTURA_COMPLETA.docx
+++ b/DOCUMENTACION_ARQUITECTURA_COMPLETA.docx
@@ -15,7 +15,17 @@
         <w:pStyle w:val="IntenseQuote"/>
       </w:pPr>
       <w:r>
-        <w:t xml:space="preserve">Última actualización: 2026-10-03 (Hábito "Dieta" — </w:t>
+        <w:t xml:space="preserve">Última actualización: 2026-10-03 (Blindaje del casino — </w:t>
+      </w:r>
+      <w:r>
+        <w:rPr>
+          <w:rFonts w:ascii="Consolas" w:hAnsi="Consolas"/>
+          <w:sz w:val="18"/>
+        </w:rPr>
+        <w:t>supabase/casino_blindaje.sql</w:t>
+      </w:r>
+      <w:r>
+        <w:t xml:space="preserve">; antes ese día, hábito "Dieta" — </w:t>
       </w:r>
       <w:r>
         <w:rPr>
@@ -80,6 +90,33 @@
       </w:pPr>
       <w:r>
         <w:t>CHANGELOG</w:t>
+      </w:r>
+    </w:p>
+    <w:p>
+      <w:pPr>
+        <w:pStyle w:val="ListBullet"/>
+      </w:pPr>
+      <w:r>
+        <w:t xml:space="preserve">2026-10-03 — </w:t>
+      </w:r>
+      <w:r>
+        <w:rPr>
+          <w:b/>
+        </w:rPr>
+        <w:t>Blindaje del casino</w:t>
+      </w:r>
+      <w:r>
+        <w:t xml:space="preserve"> (</w:t>
+      </w:r>
+      <w:r>
+        <w:rPr>
+          <w:rFonts w:ascii="Consolas" w:hAnsi="Consolas"/>
+          <w:sz w:val="18"/>
+        </w:rPr>
+        <w:t>supabase/casino_blindaje.sql</w:t>
+      </w:r>
+      <w:r>
+        <w:t>). Un usuario consiguió 5,000 peseis "extra"; la causa más probable fue comprar 5,000 peseis con saldo 0 mientras tenía toda su apuesta en una mano de blackjack abierta. Ahora: compra y easter egg exigen quiebra de verdad (sin mano abierta), cada apuesta abre una ronda y el premio solo se paga contra ella con tope por juego, el blackjack cobra antes de repartir (cerraba una carrera que permitía cobrar una mano sin haber pagado la apuesta), límite de 12 apuestas cada 10 s, y auditoría de saldos. Ver sección 9.</w:t>
       </w:r>
     </w:p>
     <w:p>
@@ -788,7 +825,7 @@
           </w:tcPr>
           <w:p>
             <w:r>
-              <w:t>Saldo de peseis, movimientos, poderes</w:t>
+              <w:t>Saldo de peseis, movimientos, rondas de juego, auditoría de saldos, poderes</w:t>
             </w:r>
           </w:p>
         </w:tc>
@@ -1151,6 +1188,30 @@
       </w:r>
       <w:r>
         <w:t xml:space="preserve"> — agrega "dieta" al anuncio automático de evidencia (ver sección 8). Se puede repetir.</w:t>
+      </w:r>
+    </w:p>
+    <w:p>
+      <w:pPr>
+        <w:pStyle w:val="ListNumber"/>
+      </w:pPr>
+      <w:r>
+        <w:rPr>
+          <w:b/>
+        </w:rPr>
+        <w:t>`casino_blindaje.sql`</w:t>
+      </w:r>
+      <w:r>
+        <w:t xml:space="preserve"> — rondas de juego, topes de premio, quiebra de verdad, límite de velocidad y auditoría (ver sección 9). Se puede repetir. Córrelo y sube el código en seguida: elimina </w:t>
+      </w:r>
+      <w:r>
+        <w:rPr>
+          <w:rFonts w:ascii="Consolas" w:hAnsi="Consolas"/>
+          <w:sz w:val="18"/>
+        </w:rPr>
+        <w:t>casino_apply</w:t>
+      </w:r>
+      <w:r>
+        <w:t>, que la versión anterior de la app usaba.</w:t>
       </w:r>
     </w:p>
     <w:p>
@@ -3307,7 +3368,416 @@
         <w:pStyle w:val="Heading1"/>
       </w:pPr>
       <w:r>
-        <w:t>9. Seguridad (resumen)</w:t>
+        <w:t>9. Casino: cómo se mueve el saldo (blindaje)</w:t>
+      </w:r>
+    </w:p>
+    <w:p>
+      <w:pPr>
+        <w:pStyle w:val="Heading2"/>
+      </w:pPr>
+      <w:r>
+        <w:t>9.1 Regla general</w:t>
+      </w:r>
+    </w:p>
+    <w:p>
+      <w:r>
+        <w:t xml:space="preserve">El navegador solo manda </w:t>
+      </w:r>
+      <w:r>
+        <w:rPr>
+          <w:b/>
+        </w:rPr>
+        <w:t>qué quiere apostar</w:t>
+      </w:r>
+      <w:r>
+        <w:t xml:space="preserve"> (fichas y casillas en la ruleta, monto en tragamonedas, monto y acción en blackjack). El resultado del juego (número de la ruleta, carretes, cartas) y el premio los calcula </w:t>
+      </w:r>
+      <w:r>
+        <w:rPr>
+          <w:b/>
+        </w:rPr>
+        <w:t>el servidor</w:t>
+      </w:r>
+      <w:r>
+        <w:t xml:space="preserve"> con </w:t>
+      </w:r>
+      <w:r>
+        <w:rPr>
+          <w:rFonts w:ascii="Consolas" w:hAnsi="Consolas"/>
+          <w:sz w:val="18"/>
+        </w:rPr>
+        <w:t>crypto.getRandomValues</w:t>
+      </w:r>
+      <w:r>
+        <w:t xml:space="preserve">. Ninguna ruta acepta un saldo, un premio ni un resultado del navegador; la ruleta además copia solo </w:t>
+      </w:r>
+      <w:r>
+        <w:rPr>
+          <w:rFonts w:ascii="Consolas" w:hAnsi="Consolas"/>
+          <w:sz w:val="18"/>
+        </w:rPr>
+        <w:t>type</w:t>
+      </w:r>
+      <w:r>
+        <w:t xml:space="preserve">, </w:t>
+      </w:r>
+      <w:r>
+        <w:rPr>
+          <w:rFonts w:ascii="Consolas" w:hAnsi="Consolas"/>
+          <w:sz w:val="18"/>
+        </w:rPr>
+        <w:t>value</w:t>
+      </w:r>
+      <w:r>
+        <w:t xml:space="preserve"> y </w:t>
+      </w:r>
+      <w:r>
+        <w:rPr>
+          <w:rFonts w:ascii="Consolas" w:hAnsi="Consolas"/>
+          <w:sz w:val="18"/>
+        </w:rPr>
+        <w:t>amount</w:t>
+      </w:r>
+      <w:r>
+        <w:t xml:space="preserve"> de cada apuesta.</w:t>
+      </w:r>
+    </w:p>
+    <w:p>
+      <w:pPr>
+        <w:pStyle w:val="Heading2"/>
+      </w:pPr>
+      <w:r>
+        <w:t>9.2 Rondas (`casino_rounds`)</w:t>
+      </w:r>
+    </w:p>
+    <w:p>
+      <w:r>
+        <w:t>Cada apuesta abre una ronda (en blackjack, una por mano). Las funciones (</w:t>
+      </w:r>
+      <w:r>
+        <w:rPr>
+          <w:rFonts w:ascii="Consolas" w:hAnsi="Consolas"/>
+          <w:sz w:val="18"/>
+        </w:rPr>
+        <w:t>security definer</w:t>
+      </w:r>
+      <w:r>
+        <w:t xml:space="preserve">, solo </w:t>
+      </w:r>
+      <w:r>
+        <w:rPr>
+          <w:rFonts w:ascii="Consolas" w:hAnsi="Consolas"/>
+          <w:sz w:val="18"/>
+        </w:rPr>
+        <w:t>service_role</w:t>
+      </w:r>
+      <w:r>
+        <w:t>):</w:t>
+      </w:r>
+    </w:p>
+    <w:tbl>
+      <w:tblPr>
+        <w:tblStyle w:val="TableGrid"/>
+        <w:tblW w:type="auto" w:w="0"/>
+        <w:tblLook w:firstColumn="1" w:firstRow="1" w:lastColumn="0" w:lastRow="0" w:noHBand="0" w:noVBand="1" w:val="04A0"/>
+      </w:tblPr>
+      <w:tblGrid>
+        <w:gridCol w:w="4320"/>
+        <w:gridCol w:w="4320"/>
+      </w:tblGrid>
+      <w:tr>
+        <w:tc>
+          <w:tcPr>
+            <w:tcW w:type="dxa" w:w="4320"/>
+          </w:tcPr>
+          <w:p>
+            <w:r>
+              <w:rPr>
+                <w:b/>
+              </w:rPr>
+              <w:t>Función</w:t>
+            </w:r>
+          </w:p>
+        </w:tc>
+        <w:tc>
+          <w:tcPr>
+            <w:tcW w:type="dxa" w:w="4320"/>
+          </w:tcPr>
+          <w:p>
+            <w:r>
+              <w:rPr>
+                <w:b/>
+              </w:rPr>
+              <w:t>Qué hace</w:t>
+            </w:r>
+          </w:p>
+        </w:tc>
+      </w:tr>
+      <w:tr>
+        <w:tc>
+          <w:tcPr>
+            <w:tcW w:type="dxa" w:w="4320"/>
+          </w:tcPr>
+          <w:p>
+            <w:r>
+              <w:rPr>
+                <w:rFonts w:ascii="Consolas" w:hAnsi="Consolas"/>
+                <w:sz w:val="18"/>
+              </w:rPr>
+              <w:t>casino_place_bet(user, game, stake, source, meta)</w:t>
+            </w:r>
+          </w:p>
+        </w:tc>
+        <w:tc>
+          <w:tcPr>
+            <w:tcW w:type="dxa" w:w="4320"/>
+          </w:tcPr>
+          <w:p>
+            <w:r>
+              <w:t xml:space="preserve">Bloquea el saldo del usuario, aplica el límite de velocidad, cobra y abre la ronda. Regresa </w:t>
+            </w:r>
+            <w:r>
+              <w:rPr>
+                <w:rFonts w:ascii="Consolas" w:hAnsi="Consolas"/>
+                <w:sz w:val="18"/>
+              </w:rPr>
+              <w:t>{round_id, balance}</w:t>
+            </w:r>
+            <w:r>
+              <w:t>.</w:t>
+            </w:r>
+          </w:p>
+        </w:tc>
+      </w:tr>
+      <w:tr>
+        <w:tc>
+          <w:tcPr>
+            <w:tcW w:type="dxa" w:w="4320"/>
+          </w:tcPr>
+          <w:p>
+            <w:r>
+              <w:rPr>
+                <w:rFonts w:ascii="Consolas" w:hAnsi="Consolas"/>
+                <w:sz w:val="18"/>
+              </w:rPr>
+              <w:t>casino_raise_bet(user, round, extra, source)</w:t>
+            </w:r>
+          </w:p>
+        </w:tc>
+        <w:tc>
+          <w:tcPr>
+            <w:tcW w:type="dxa" w:w="4320"/>
+          </w:tcPr>
+          <w:p>
+            <w:r>
+              <w:t>Blackjack: doblar. Solo una vez por mano y solo por el monto original.</w:t>
+            </w:r>
+          </w:p>
+        </w:tc>
+      </w:tr>
+      <w:tr>
+        <w:tc>
+          <w:tcPr>
+            <w:tcW w:type="dxa" w:w="4320"/>
+          </w:tcPr>
+          <w:p>
+            <w:r>
+              <w:rPr>
+                <w:rFonts w:ascii="Consolas" w:hAnsi="Consolas"/>
+                <w:sz w:val="18"/>
+              </w:rPr>
+              <w:t>casino_settle(user, round, payout, source, meta)</w:t>
+            </w:r>
+          </w:p>
+        </w:tc>
+        <w:tc>
+          <w:tcPr>
+            <w:tcW w:type="dxa" w:w="4320"/>
+          </w:tcPr>
+          <w:p>
+            <w:r>
+              <w:t xml:space="preserve">Cierra la ronda y paga. Falla si la ronda no es del usuario, ya se cerró, o si el premio pasa de </w:t>
+            </w:r>
+            <w:r>
+              <w:rPr>
+                <w:rFonts w:ascii="Consolas" w:hAnsi="Consolas"/>
+                <w:sz w:val="18"/>
+              </w:rPr>
+              <w:t>apuesta × multiplicador máximo</w:t>
+            </w:r>
+            <w:r>
+              <w:t xml:space="preserve"> (ruleta 36, tragamonedas 250, blackjack 2.5).</w:t>
+            </w:r>
+          </w:p>
+        </w:tc>
+      </w:tr>
+      <w:tr>
+        <w:tc>
+          <w:tcPr>
+            <w:tcW w:type="dxa" w:w="4320"/>
+          </w:tcPr>
+          <w:p>
+            <w:r>
+              <w:rPr>
+                <w:rFonts w:ascii="Consolas" w:hAnsi="Consolas"/>
+                <w:sz w:val="18"/>
+              </w:rPr>
+              <w:t>casino_refund(user, round, source)</w:t>
+            </w:r>
+          </w:p>
+        </w:tc>
+        <w:tc>
+          <w:tcPr>
+            <w:tcW w:type="dxa" w:w="4320"/>
+          </w:tcPr>
+          <w:p>
+            <w:r>
+              <w:t>Si la jugada no se pudo guardar, regresa exactamente lo apostado (</w:t>
+            </w:r>
+            <w:r>
+              <w:rPr>
+                <w:rFonts w:ascii="Consolas" w:hAnsi="Consolas"/>
+                <w:sz w:val="18"/>
+              </w:rPr>
+              <w:t>bet_refund</w:t>
+            </w:r>
+            <w:r>
+              <w:t>).</w:t>
+            </w:r>
+          </w:p>
+        </w:tc>
+      </w:tr>
+    </w:tbl>
+    <w:p>
+      <w:r>
+        <w:t xml:space="preserve">La función genérica </w:t>
+      </w:r>
+      <w:r>
+        <w:rPr>
+          <w:rFonts w:ascii="Consolas" w:hAnsi="Consolas"/>
+          <w:sz w:val="18"/>
+        </w:rPr>
+        <w:t>casino_apply</w:t>
+      </w:r>
+      <w:r>
+        <w:t xml:space="preserve"> (que sumaba cualquier monto) se eliminó. En el servidor se usan con </w:t>
+      </w:r>
+      <w:r>
+        <w:rPr>
+          <w:rFonts w:ascii="Consolas" w:hAnsi="Consolas"/>
+          <w:sz w:val="18"/>
+        </w:rPr>
+        <w:t>placeBet</w:t>
+      </w:r>
+      <w:r>
+        <w:t xml:space="preserve">, </w:t>
+      </w:r>
+      <w:r>
+        <w:rPr>
+          <w:rFonts w:ascii="Consolas" w:hAnsi="Consolas"/>
+          <w:sz w:val="18"/>
+        </w:rPr>
+        <w:t>settleRound</w:t>
+      </w:r>
+      <w:r>
+        <w:t xml:space="preserve">, </w:t>
+      </w:r>
+      <w:r>
+        <w:rPr>
+          <w:rFonts w:ascii="Consolas" w:hAnsi="Consolas"/>
+          <w:sz w:val="18"/>
+        </w:rPr>
+        <w:t>raiseBet</w:t>
+      </w:r>
+      <w:r>
+        <w:t xml:space="preserve"> y </w:t>
+      </w:r>
+      <w:r>
+        <w:rPr>
+          <w:rFonts w:ascii="Consolas" w:hAnsi="Consolas"/>
+          <w:sz w:val="18"/>
+        </w:rPr>
+        <w:t>refundRound</w:t>
+      </w:r>
+      <w:r>
+        <w:t xml:space="preserve"> de </w:t>
+      </w:r>
+      <w:r>
+        <w:rPr>
+          <w:rFonts w:ascii="Consolas" w:hAnsi="Consolas"/>
+          <w:sz w:val="18"/>
+        </w:rPr>
+        <w:t>src/lib/server/casino.ts</w:t>
+      </w:r>
+      <w:r>
+        <w:t xml:space="preserve">. La mano de blackjack guarda su </w:t>
+      </w:r>
+      <w:r>
+        <w:rPr>
+          <w:rFonts w:ascii="Consolas" w:hAnsi="Consolas"/>
+          <w:sz w:val="18"/>
+        </w:rPr>
+        <w:t>roundId</w:t>
+      </w:r>
+      <w:r>
+        <w:t xml:space="preserve"> (nunca se manda al navegador).</w:t>
+      </w:r>
+    </w:p>
+    <w:p>
+      <w:pPr>
+        <w:pStyle w:val="Heading2"/>
+      </w:pPr>
+      <w:r>
+        <w:t>9.3 Quiebra de verdad</w:t>
+      </w:r>
+    </w:p>
+    <w:p>
+      <w:r>
+        <w:rPr>
+          <w:rFonts w:ascii="Consolas" w:hAnsi="Consolas"/>
+          <w:sz w:val="18"/>
+        </w:rPr>
+        <w:t>casino_is_broke(user)</w:t>
+      </w:r>
+      <w:r>
+        <w:t xml:space="preserve">: saldo 0 </w:t>
+      </w:r>
+      <w:r>
+        <w:rPr>
+          <w:b/>
+        </w:rPr>
+        <w:t>y</w:t>
+      </w:r>
+      <w:r>
+        <w:t xml:space="preserve"> sin ronda de blackjack abierta (últimas 24 h) ni otra ronda abierta en los últimos 5 minutos. Lo exigen </w:t>
+      </w:r>
+      <w:r>
+        <w:rPr>
+          <w:rFonts w:ascii="Consolas" w:hAnsi="Consolas"/>
+          <w:sz w:val="18"/>
+        </w:rPr>
+        <w:t>casino_buy_peseis</w:t>
+      </w:r>
+      <w:r>
+        <w:t xml:space="preserve"> (5,000 peseis por 1 punto) y </w:t>
+      </w:r>
+      <w:r>
+        <w:rPr>
+          <w:rFonts w:ascii="Consolas" w:hAnsi="Consolas"/>
+          <w:sz w:val="18"/>
+        </w:rPr>
+        <w:t>casino_easter_egg</w:t>
+      </w:r>
+      <w:r>
+        <w:t xml:space="preserve"> (50 peseis). Antes bastaba con saldo 0, así que se podía apostar todo en blackjack, comprar 5,000 con la mano abierta y luego plantarse.</w:t>
+      </w:r>
+    </w:p>
+    <w:p>
+      <w:pPr>
+        <w:pStyle w:val="Heading2"/>
+      </w:pPr>
+      <w:r>
+        <w:t>9.4 Carreras y repeticiones</w:t>
       </w:r>
     </w:p>
     <w:p>
@@ -3315,6 +3785,339 @@
         <w:pStyle w:val="ListBullet"/>
       </w:pPr>
       <w:r>
+        <w:t xml:space="preserve">Blackjack cobra </w:t>
+      </w:r>
+      <w:r>
+        <w:rPr>
+          <w:b/>
+        </w:rPr>
+        <w:t>antes</w:t>
+      </w:r>
+      <w:r>
+        <w:t xml:space="preserve"> de repartir. Antes repartía, guardaba y luego cobraba: en ese hueco otra petición podía plantarse y cobrar la mano; si el cobro después fallaba, la mano no se deshacía y el premio ya estaba pagado.</w:t>
+      </w:r>
+    </w:p>
+    <w:p>
+      <w:pPr>
+        <w:pStyle w:val="ListBullet"/>
+      </w:pPr>
+      <w:r>
+        <w:t xml:space="preserve">Al doblar, primero se guarda la jugada (con </w:t>
+      </w:r>
+      <w:r>
+        <w:rPr>
+          <w:rFonts w:ascii="Consolas" w:hAnsi="Consolas"/>
+          <w:sz w:val="18"/>
+        </w:rPr>
+        <w:t>version</w:t>
+      </w:r>
+      <w:r>
+        <w:t>) y luego se cobra; si no alcanza, se deshace.</w:t>
+      </w:r>
+    </w:p>
+    <w:p>
+      <w:pPr>
+        <w:pStyle w:val="ListBullet"/>
+      </w:pPr>
+      <w:r>
+        <w:t xml:space="preserve">Cada ronda se paga una sola vez (candado </w:t>
+      </w:r>
+      <w:r>
+        <w:rPr>
+          <w:rFonts w:ascii="Consolas" w:hAnsi="Consolas"/>
+          <w:sz w:val="18"/>
+        </w:rPr>
+        <w:t>for update</w:t>
+      </w:r>
+      <w:r>
+        <w:t xml:space="preserve"> y </w:t>
+      </w:r>
+      <w:r>
+        <w:rPr>
+          <w:rFonts w:ascii="Consolas" w:hAnsi="Consolas"/>
+          <w:sz w:val="18"/>
+        </w:rPr>
+        <w:t>status = 'open'</w:t>
+      </w:r>
+      <w:r>
+        <w:t>), aunque lleguen dos peticiones iguales.</w:t>
+      </w:r>
+    </w:p>
+    <w:p>
+      <w:pPr>
+        <w:pStyle w:val="ListBullet"/>
+      </w:pPr>
+      <w:r>
+        <w:t>Límite: 12 apuestas por usuario cada 10 segundos (</w:t>
+      </w:r>
+      <w:r>
+        <w:rPr>
+          <w:rFonts w:ascii="Consolas" w:hAnsi="Consolas"/>
+          <w:sz w:val="18"/>
+        </w:rPr>
+        <w:t>demasiado rápido</w:t>
+      </w:r>
+      <w:r>
+        <w:t xml:space="preserve"> → HTTP 429).</w:t>
+      </w:r>
+    </w:p>
+    <w:p>
+      <w:pPr>
+        <w:pStyle w:val="ListBullet"/>
+      </w:pPr>
+      <w:r>
+        <w:t>Compra y easter egg bloquean la fila del saldo (</w:t>
+      </w:r>
+      <w:r>
+        <w:rPr>
+          <w:rFonts w:ascii="Consolas" w:hAnsi="Consolas"/>
+          <w:sz w:val="18"/>
+        </w:rPr>
+        <w:t>for update</w:t>
+      </w:r>
+      <w:r>
+        <w:t>), así que dos llamadas a la vez no cobran dos veces.</w:t>
+      </w:r>
+    </w:p>
+    <w:p>
+      <w:pPr>
+        <w:pStyle w:val="Heading2"/>
+      </w:pPr>
+      <w:r>
+        <w:t>9.5 Auditoría</w:t>
+      </w:r>
+    </w:p>
+    <w:p>
+      <w:pPr>
+        <w:pStyle w:val="ListBullet"/>
+      </w:pPr>
+      <w:r>
+        <w:rPr>
+          <w:rFonts w:ascii="Consolas" w:hAnsi="Consolas"/>
+          <w:sz w:val="18"/>
+        </w:rPr>
+        <w:t>casino_transactions</w:t>
+      </w:r>
+      <w:r>
+        <w:t xml:space="preserve"> ahora guarda </w:t>
+      </w:r>
+      <w:r>
+        <w:rPr>
+          <w:rFonts w:ascii="Consolas" w:hAnsi="Consolas"/>
+          <w:sz w:val="18"/>
+        </w:rPr>
+        <w:t>source</w:t>
+      </w:r>
+      <w:r>
+        <w:t xml:space="preserve"> (ruta o función: </w:t>
+      </w:r>
+      <w:r>
+        <w:rPr>
+          <w:rFonts w:ascii="Consolas" w:hAnsi="Consolas"/>
+          <w:sz w:val="18"/>
+        </w:rPr>
+        <w:t>api/casino/roulette</w:t>
+      </w:r>
+      <w:r>
+        <w:t xml:space="preserve">, </w:t>
+      </w:r>
+      <w:r>
+        <w:rPr>
+          <w:rFonts w:ascii="Consolas" w:hAnsi="Consolas"/>
+          <w:sz w:val="18"/>
+        </w:rPr>
+        <w:t>rpc:casino_buy_peseis</w:t>
+      </w:r>
+      <w:r>
+        <w:t xml:space="preserve">, …), </w:t>
+      </w:r>
+      <w:r>
+        <w:rPr>
+          <w:rFonts w:ascii="Consolas" w:hAnsi="Consolas"/>
+          <w:sz w:val="18"/>
+        </w:rPr>
+        <w:t>round_id</w:t>
+      </w:r>
+      <w:r>
+        <w:t xml:space="preserve"> y </w:t>
+      </w:r>
+      <w:r>
+        <w:rPr>
+          <w:rFonts w:ascii="Consolas" w:hAnsi="Consolas"/>
+          <w:sz w:val="18"/>
+        </w:rPr>
+        <w:t>balance_after</w:t>
+      </w:r>
+      <w:r>
+        <w:t xml:space="preserve">. Tipos: </w:t>
+      </w:r>
+      <w:r>
+        <w:rPr>
+          <w:rFonts w:ascii="Consolas" w:hAnsi="Consolas"/>
+          <w:sz w:val="18"/>
+        </w:rPr>
+        <w:t>bet</w:t>
+      </w:r>
+      <w:r>
+        <w:t xml:space="preserve">, </w:t>
+      </w:r>
+      <w:r>
+        <w:rPr>
+          <w:rFonts w:ascii="Consolas" w:hAnsi="Consolas"/>
+          <w:sz w:val="18"/>
+        </w:rPr>
+        <w:t>bet_win</w:t>
+      </w:r>
+      <w:r>
+        <w:t xml:space="preserve">, </w:t>
+      </w:r>
+      <w:r>
+        <w:rPr>
+          <w:rFonts w:ascii="Consolas" w:hAnsi="Consolas"/>
+          <w:sz w:val="18"/>
+        </w:rPr>
+        <w:t>bet_refund</w:t>
+      </w:r>
+      <w:r>
+        <w:t xml:space="preserve">, </w:t>
+      </w:r>
+      <w:r>
+        <w:rPr>
+          <w:rFonts w:ascii="Consolas" w:hAnsi="Consolas"/>
+          <w:sz w:val="18"/>
+        </w:rPr>
+        <w:t>buy_peseis</w:t>
+      </w:r>
+      <w:r>
+        <w:t xml:space="preserve">, </w:t>
+      </w:r>
+      <w:r>
+        <w:rPr>
+          <w:rFonts w:ascii="Consolas" w:hAnsi="Consolas"/>
+          <w:sz w:val="18"/>
+        </w:rPr>
+        <w:t>unlock_power</w:t>
+      </w:r>
+      <w:r>
+        <w:t xml:space="preserve">, </w:t>
+      </w:r>
+      <w:r>
+        <w:rPr>
+          <w:rFonts w:ascii="Consolas" w:hAnsi="Consolas"/>
+          <w:sz w:val="18"/>
+        </w:rPr>
+        <w:t>admin_grant</w:t>
+      </w:r>
+      <w:r>
+        <w:t xml:space="preserve">, </w:t>
+      </w:r>
+      <w:r>
+        <w:rPr>
+          <w:rFonts w:ascii="Consolas" w:hAnsi="Consolas"/>
+          <w:sz w:val="18"/>
+        </w:rPr>
+        <w:t>easter_egg</w:t>
+      </w:r>
+      <w:r>
+        <w:t>.</w:t>
+      </w:r>
+    </w:p>
+    <w:p>
+      <w:pPr>
+        <w:pStyle w:val="ListBullet"/>
+      </w:pPr>
+      <w:r>
+        <w:rPr>
+          <w:rFonts w:ascii="Consolas" w:hAnsi="Consolas"/>
+          <w:sz w:val="18"/>
+        </w:rPr>
+        <w:t>casino_balance_audit</w:t>
+      </w:r>
+      <w:r>
+        <w:t xml:space="preserve"> (trigger en </w:t>
+      </w:r>
+      <w:r>
+        <w:rPr>
+          <w:rFonts w:ascii="Consolas" w:hAnsi="Consolas"/>
+          <w:sz w:val="18"/>
+        </w:rPr>
+        <w:t>casino_balance</w:t>
+      </w:r>
+      <w:r>
+        <w:t>): cada cambio de saldo con saldo anterior, nuevo, diferencia, rol de base de datos y hora, aunque se haga a mano en el SQL Editor. Sin políticas RLS: solo se consulta desde Supabase.</w:t>
+      </w:r>
+    </w:p>
+    <w:p>
+      <w:pPr>
+        <w:pStyle w:val="ListBullet"/>
+      </w:pPr>
+      <w:r>
+        <w:t xml:space="preserve">Para cuadrar a un usuario: saldo actual = 10,000 + suma de </w:t>
+      </w:r>
+      <w:r>
+        <w:rPr>
+          <w:rFonts w:ascii="Consolas" w:hAnsi="Consolas"/>
+          <w:sz w:val="18"/>
+        </w:rPr>
+        <w:t>amount</w:t>
+      </w:r>
+      <w:r>
+        <w:t xml:space="preserve"> de sus movimientos. Una diferencia indica un cambio de saldo que no pasó por las funciones del casino; </w:t>
+      </w:r>
+      <w:r>
+        <w:rPr>
+          <w:rFonts w:ascii="Consolas" w:hAnsi="Consolas"/>
+          <w:sz w:val="18"/>
+        </w:rPr>
+        <w:t>casino_balance_audit</w:t>
+      </w:r>
+      <w:r>
+        <w:t xml:space="preserve"> dice cuándo.</w:t>
+      </w:r>
+    </w:p>
+    <w:p>
+      <w:pPr>
+        <w:pStyle w:val="Heading2"/>
+      </w:pPr>
+      <w:r>
+        <w:t>9.6 Pendiente fuera del casino</w:t>
+      </w:r>
+    </w:p>
+    <w:p>
+      <w:r>
+        <w:rPr>
+          <w:rFonts w:ascii="Consolas" w:hAnsi="Consolas"/>
+          <w:sz w:val="18"/>
+        </w:rPr>
+        <w:t>habit_checks</w:t>
+      </w:r>
+      <w:r>
+        <w:t xml:space="preserve"> acepta cualquier </w:t>
+      </w:r>
+      <w:r>
+        <w:rPr>
+          <w:rFonts w:ascii="Consolas" w:hAnsi="Consolas"/>
+          <w:sz w:val="18"/>
+        </w:rPr>
+        <w:t>habit_key</w:t>
+      </w:r>
+      <w:r>
+        <w:t xml:space="preserve"> (ver sección 8), así que alguien podría insertar claves inventadas por la API y sumar puntos, y con ellos comprar peseis. No se cambió en este blindaje porque es lógica de hábitos.</w:t>
+      </w:r>
+    </w:p>
+    <w:p>
+      <w:pPr>
+        <w:pStyle w:val="Heading1"/>
+      </w:pPr>
+      <w:r>
+        <w:t>10. Seguridad (resumen)</w:t>
+      </w:r>
+    </w:p>
+    <w:p>
+      <w:pPr>
+        <w:pStyle w:val="ListBullet"/>
+      </w:pPr>
+      <w:r>
         <w:t xml:space="preserve">RLS en todas las tablas. Escrituras sensibles (puntos del casino, apuestas, ajedrez, grupos) solo por funciones </w:t>
       </w:r>
       <w:r>
@@ -3343,6 +4146,14 @@
         <w:pStyle w:val="ListBullet"/>
       </w:pPr>
       <w:r>
+        <w:t>Casino: resultados y premios solo en el servidor, pagos atados a rondas con tope por juego, auditoría de saldos (sección 9).</w:t>
+      </w:r>
+    </w:p>
+    <w:p>
+      <w:pPr>
+        <w:pStyle w:val="ListBullet"/>
+      </w:pPr>
+      <w:r>
         <w:t xml:space="preserve">Los anuncios del chat solo los puede crear la base de datos (triggers); el usuario no puede insertar </w:t>
       </w:r>
       <w:r>
@@ -3389,7 +4200,7 @@
         <w:pStyle w:val="Heading1"/>
       </w:pPr>
       <w:r>
-        <w:t>10. Cómo correr</w:t>
+        <w:t>11. Cómo correr</w:t>
       </w:r>
     </w:p>
     <w:p>

</xml_diff>

<commit_message>
Cardio: km desde el calendario y bonus +5 por distancia (5km running, 20km bici, 2km natacion)
</commit_message>
<xml_diff>
--- a/DOCUMENTACION_ARQUITECTURA_COMPLETA.docx
+++ b/DOCUMENTACION_ARQUITECTURA_COMPLETA.docx
@@ -15,7 +15,17 @@
         <w:pStyle w:val="IntenseQuote"/>
       </w:pPr>
       <w:r>
-        <w:t xml:space="preserve">Última actualización: 2026-10-03 (Blindaje del casino — </w:t>
+        <w:t xml:space="preserve">Última actualización: 2026-10-04 (Bonus de cardio por distancia y actividad desde el calendario — </w:t>
+      </w:r>
+      <w:r>
+        <w:rPr>
+          <w:rFonts w:ascii="Consolas" w:hAnsi="Consolas"/>
+          <w:sz w:val="18"/>
+        </w:rPr>
+        <w:t>supabase/cardio_distancia.sql</w:t>
+      </w:r>
+      <w:r>
+        <w:t xml:space="preserve">; el 2026-10-03, blindaje del casino — </w:t>
       </w:r>
       <w:r>
         <w:rPr>
@@ -97,6 +107,53 @@
         <w:pStyle w:val="ListBullet"/>
       </w:pPr>
       <w:r>
+        <w:t xml:space="preserve">2026-10-04 — </w:t>
+      </w:r>
+      <w:r>
+        <w:rPr>
+          <w:b/>
+        </w:rPr>
+        <w:t>Bonus de cardio por distancia</w:t>
+      </w:r>
+      <w:r>
+        <w:t xml:space="preserve"> (</w:t>
+      </w:r>
+      <w:r>
+        <w:rPr>
+          <w:rFonts w:ascii="Consolas" w:hAnsi="Consolas"/>
+          <w:sz w:val="18"/>
+        </w:rPr>
+        <w:t>supabase/cardio_distancia.sql</w:t>
+      </w:r>
+      <w:r>
+        <w:t xml:space="preserve">). El formulario manual de "Kilómetros" sale de Stats: la actividad (tipo, km, minutos) ahora se registra en el mismo modal de la foto al tachar Cardio. Si llega al umbral (running 5 km+, bici 20 km+, natación 2 km+) la base crea un bonus de +5 en </w:t>
+      </w:r>
+      <w:r>
+        <w:rPr>
+          <w:rFonts w:ascii="Consolas" w:hAnsi="Consolas"/>
+          <w:sz w:val="18"/>
+        </w:rPr>
+        <w:t>bonus_events</w:t>
+      </w:r>
+      <w:r>
+        <w:t xml:space="preserve"> (</w:t>
+      </w:r>
+      <w:r>
+        <w:rPr>
+          <w:rFonts w:ascii="Consolas" w:hAnsi="Consolas"/>
+          <w:sz w:val="18"/>
+        </w:rPr>
+        <w:t>cardio_distance</w:t>
+      </w:r>
+      <w:r>
+        <w:t>), aparte del +1 del hábito y del +5 semanal de 3 cardios. Máximo uno por día. Anuncio en el chat ("🏃 X corrió 6km y ganó un bonus de +5 pts"). Ver sección 9.</w:t>
+      </w:r>
+    </w:p>
+    <w:p>
+      <w:pPr>
+        <w:pStyle w:val="ListBullet"/>
+      </w:pPr>
+      <w:r>
         <w:t xml:space="preserve">2026-10-03 — </w:t>
       </w:r>
       <w:r>
@@ -116,7 +173,7 @@
         <w:t>supabase/casino_blindaje.sql</w:t>
       </w:r>
       <w:r>
-        <w:t>). Un usuario consiguió 5,000 peseis "extra"; la causa más probable fue comprar 5,000 peseis con saldo 0 mientras tenía toda su apuesta en una mano de blackjack abierta. Ahora: compra y easter egg exigen quiebra de verdad (sin mano abierta), cada apuesta abre una ronda y el premio solo se paga contra ella con tope por juego, el blackjack cobra antes de repartir (cerraba una carrera que permitía cobrar una mano sin haber pagado la apuesta), límite de 12 apuestas cada 10 s, y auditoría de saldos. Ver sección 9.</w:t>
+        <w:t>). Un usuario consiguió 5,000 peseis "extra"; la causa más probable fue comprar 5,000 peseis con saldo 0 mientras tenía toda su apuesta en una mano de blackjack abierta. Ahora: compra y easter egg exigen quiebra de verdad (sin mano abierta), cada apuesta abre una ronda y el premio solo se paga contra ella con tope por juego, el blackjack cobra antes de repartir (cerraba una carrera que permitía cobrar una mano sin haber pagado la apuesta), límite de 12 apuestas cada 10 s, y auditoría de saldos. Ver sección 10.</w:t>
       </w:r>
     </w:p>
     <w:p>
@@ -400,9 +457,9 @@
         <w:br/>
         <w:t xml:space="preserve">    (app)/layout.tsx          Protege las pantallas con sesión; monta GroupProvider, BottomNav y DailyBanner</w:t>
         <w:br/>
-        <w:t xml:space="preserve">    (app)/calendario          Marcar hábitos, bonus (libro, medio maratón), evidencia fotográfica</w:t>
+        <w:t xml:space="preserve">    (app)/calendario          Marcar hábitos, bonus (libro, medio maratón), evidencia fotográfica, km de cardio</w:t>
         <w:br/>
-        <w:t xml:space="preserve">    (app)/stats               Selector de grupo + resumen, ranking del grupo, gráficas, actividad, Hevy</w:t>
+        <w:t xml:space="preserve">    (app)/stats               Selector de grupo + resumen, ranking del grupo, gráficas, km (solo lectura), Hevy</w:t>
         <w:br/>
         <w:t xml:space="preserve">    (app)/chat                Chat en tiempo real del grupo activo (+ anuncios automáticos)</w:t>
         <w:br/>
@@ -602,7 +659,7 @@
           </w:tcPr>
           <w:p>
             <w:r>
-              <w:t>Libro (+5), medio maratón (+50)</w:t>
+              <w:t>Libro (+5), medio maratón (+50), cardio por distancia (+5, lo crea un trigger)</w:t>
             </w:r>
           </w:p>
         </w:tc>
@@ -648,7 +705,17 @@
           </w:tcPr>
           <w:p>
             <w:r>
-              <w:t>Km manuales, sets de Hevy (privados)</w:t>
+              <w:t xml:space="preserve">Km de cardio (desde el calendario; </w:t>
+            </w:r>
+            <w:r>
+              <w:rPr>
+                <w:rFonts w:ascii="Consolas" w:hAnsi="Consolas"/>
+                <w:sz w:val="18"/>
+              </w:rPr>
+              <w:t>from_habit</w:t>
+            </w:r>
+            <w:r>
+              <w:t>), sets de Hevy (privados)</w:t>
             </w:r>
           </w:p>
         </w:tc>
@@ -1201,7 +1268,7 @@
         <w:t>`casino_blindaje.sql`</w:t>
       </w:r>
       <w:r>
-        <w:t xml:space="preserve"> — rondas de juego, topes de premio, quiebra de verdad, límite de velocidad y auditoría (ver sección 9). Se puede repetir. Córrelo y sube el código en seguida: elimina </w:t>
+        <w:t xml:space="preserve"> — rondas de juego, topes de premio, quiebra de verdad, límite de velocidad y auditoría (ver sección 10). Se puede repetir. Córrelo y sube el código en seguida: elimina </w:t>
       </w:r>
       <w:r>
         <w:rPr>
@@ -1212,6 +1279,59 @@
       </w:r>
       <w:r>
         <w:t>, que la versión anterior de la app usaba.</w:t>
+      </w:r>
+    </w:p>
+    <w:p>
+      <w:pPr>
+        <w:pStyle w:val="ListNumber"/>
+      </w:pPr>
+      <w:r>
+        <w:rPr>
+          <w:b/>
+        </w:rPr>
+        <w:t>`cardio_distancia.sql`</w:t>
+      </w:r>
+      <w:r>
+        <w:t xml:space="preserve"> — </w:t>
+      </w:r>
+      <w:r>
+        <w:rPr>
+          <w:rFonts w:ascii="Consolas" w:hAnsi="Consolas"/>
+          <w:sz w:val="18"/>
+        </w:rPr>
+        <w:t>activities.from_habit</w:t>
+      </w:r>
+      <w:r>
+        <w:t xml:space="preserve">, bonus </w:t>
+      </w:r>
+      <w:r>
+        <w:rPr>
+          <w:rFonts w:ascii="Consolas" w:hAnsi="Consolas"/>
+          <w:sz w:val="18"/>
+        </w:rPr>
+        <w:t>cardio_distance</w:t>
+      </w:r>
+      <w:r>
+        <w:t xml:space="preserve"> y sus triggers (ver sección 9). Se puede repetir. Córrelo </w:t>
+      </w:r>
+      <w:r>
+        <w:rPr>
+          <w:b/>
+        </w:rPr>
+        <w:t>antes</w:t>
+      </w:r>
+      <w:r>
+        <w:t xml:space="preserve"> de subir el código: la app nueva manda </w:t>
+      </w:r>
+      <w:r>
+        <w:rPr>
+          <w:rFonts w:ascii="Consolas" w:hAnsi="Consolas"/>
+          <w:sz w:val="18"/>
+        </w:rPr>
+        <w:t>from_habit</w:t>
+      </w:r>
+      <w:r>
+        <w:t xml:space="preserve"> al guardar la actividad.</w:t>
       </w:r>
     </w:p>
     <w:p>
@@ -2566,7 +2686,7 @@
     </w:p>
     <w:p>
       <w:r>
-        <w:t>No aplica a los bonus (libro, medio maratón), que tienen sus propias reglas de fecha.</w:t>
+        <w:t>No aplica a los bonus de libro y medio maratón, que tienen sus propias reglas de fecha. El bonus de cardio por distancia sí sigue la regla (solo hoy o ayer, sección 9).</w:t>
       </w:r>
     </w:p>
     <w:p>
@@ -3368,7 +3488,7 @@
         <w:pStyle w:val="Heading1"/>
       </w:pPr>
       <w:r>
-        <w:t>9. Casino: cómo se mueve el saldo (blindaje)</w:t>
+        <w:t>9. Cardio: actividad desde el calendario y bonus por distancia</w:t>
       </w:r>
     </w:p>
     <w:p>
@@ -3376,7 +3496,926 @@
         <w:pStyle w:val="Heading2"/>
       </w:pPr>
       <w:r>
-        <w:t>9.1 Regla general</w:t>
+        <w:t>9.1 Flujo</w:t>
+      </w:r>
+    </w:p>
+    <w:p>
+      <w:pPr>
+        <w:pStyle w:val="ListNumber"/>
+      </w:pPr>
+      <w:r>
+        <w:t xml:space="preserve">En el panel del día (hoy o ayer) se tacha </w:t>
+      </w:r>
+      <w:r>
+        <w:rPr>
+          <w:b/>
+        </w:rPr>
+        <w:t>Cardio</w:t>
+      </w:r>
+      <w:r>
+        <w:t xml:space="preserve"> → se abre </w:t>
+      </w:r>
+      <w:r>
+        <w:rPr>
+          <w:rFonts w:ascii="Consolas" w:hAnsi="Consolas"/>
+          <w:sz w:val="18"/>
+        </w:rPr>
+        <w:t>HabitPhotoModal</w:t>
+      </w:r>
+      <w:r>
+        <w:t>, que en Cardio pide además: tipo (Running / Bici / Natación), km (obligatorio) y minutos (opcional). Muestra en vivo si esa distancia gana el bonus.</w:t>
+      </w:r>
+    </w:p>
+    <w:p>
+      <w:pPr>
+        <w:pStyle w:val="ListNumber"/>
+      </w:pPr>
+      <w:r>
+        <w:t>Al guardar (</w:t>
+      </w:r>
+      <w:r>
+        <w:rPr>
+          <w:rFonts w:ascii="Consolas" w:hAnsi="Consolas"/>
+          <w:sz w:val="18"/>
+        </w:rPr>
+        <w:t>saveWithPhoto</w:t>
+      </w:r>
+      <w:r>
+        <w:t xml:space="preserve"> en </w:t>
+      </w:r>
+      <w:r>
+        <w:rPr>
+          <w:rFonts w:ascii="Consolas" w:hAnsi="Consolas"/>
+          <w:sz w:val="18"/>
+        </w:rPr>
+        <w:t>calendario/page.tsx</w:t>
+      </w:r>
+      <w:r>
+        <w:t>): sube la foto (</w:t>
+      </w:r>
+      <w:r>
+        <w:rPr>
+          <w:rFonts w:ascii="Consolas" w:hAnsi="Consolas"/>
+          <w:sz w:val="18"/>
+        </w:rPr>
+        <w:t>habit_evidence</w:t>
+      </w:r>
+      <w:r>
+        <w:t xml:space="preserve">), marca el hábito (cola offline de </w:t>
+      </w:r>
+      <w:r>
+        <w:rPr>
+          <w:rFonts w:ascii="Consolas" w:hAnsi="Consolas"/>
+          <w:sz w:val="18"/>
+        </w:rPr>
+        <w:t>useMyData</w:t>
+      </w:r>
+      <w:r>
+        <w:t xml:space="preserve">) e inserta la actividad en </w:t>
+      </w:r>
+      <w:r>
+        <w:rPr>
+          <w:rFonts w:ascii="Consolas" w:hAnsi="Consolas"/>
+          <w:sz w:val="18"/>
+        </w:rPr>
+        <w:t>activities</w:t>
+      </w:r>
+      <w:r>
+        <w:t xml:space="preserve"> con </w:t>
+      </w:r>
+      <w:r>
+        <w:rPr>
+          <w:rFonts w:ascii="Consolas" w:hAnsi="Consolas"/>
+          <w:sz w:val="18"/>
+        </w:rPr>
+        <w:t>from_habit = true</w:t>
+      </w:r>
+      <w:r>
+        <w:t>. Si la actividad falla, el modal muestra el error y al reintentar no vuelve a subir la foto.</w:t>
+      </w:r>
+    </w:p>
+    <w:p>
+      <w:pPr>
+        <w:pStyle w:val="ListNumber"/>
+      </w:pPr>
+      <w:r>
+        <w:t xml:space="preserve">La base crea el bonus (si aplica) y lo anuncia en el chat. La app lee el bonus por </w:t>
+      </w:r>
+      <w:r>
+        <w:rPr>
+          <w:rFonts w:ascii="Consolas" w:hAnsi="Consolas"/>
+          <w:sz w:val="18"/>
+        </w:rPr>
+        <w:t>activity_id</w:t>
+      </w:r>
+      <w:r>
+        <w:t>, lo agrega a "Mis bonus" y muestra la animación de +5.</w:t>
+      </w:r>
+    </w:p>
+    <w:p>
+      <w:r>
+        <w:t>Stats ya no tiene formulario: la sección "Kilómetros" (</w:t>
+      </w:r>
+      <w:r>
+        <w:rPr>
+          <w:rFonts w:ascii="Consolas" w:hAnsi="Consolas"/>
+          <w:sz w:val="18"/>
+        </w:rPr>
+        <w:t>stats/Activities.tsx</w:t>
+      </w:r>
+      <w:r>
+        <w:t>) conserva las gráficas (km por tipo, km por semana) y la lista de las últimas 10 con botón de borrar. Las actividades registradas antes desde Stats se quedan igual (</w:t>
+      </w:r>
+      <w:r>
+        <w:rPr>
+          <w:rFonts w:ascii="Consolas" w:hAnsi="Consolas"/>
+          <w:sz w:val="18"/>
+        </w:rPr>
+        <w:t>from_habit = false</w:t>
+      </w:r>
+      <w:r>
+        <w:t>).</w:t>
+      </w:r>
+    </w:p>
+    <w:p>
+      <w:pPr>
+        <w:pStyle w:val="Heading2"/>
+      </w:pPr>
+      <w:r>
+        <w:t>9.2 Regla del bonus</w:t>
+      </w:r>
+    </w:p>
+    <w:tbl>
+      <w:tblPr>
+        <w:tblStyle w:val="TableGrid"/>
+        <w:tblW w:type="auto" w:w="0"/>
+        <w:tblLook w:firstColumn="1" w:firstRow="1" w:lastColumn="0" w:lastRow="0" w:noHBand="0" w:noVBand="1" w:val="04A0"/>
+      </w:tblPr>
+      <w:tblGrid>
+        <w:gridCol w:w="2880"/>
+        <w:gridCol w:w="2880"/>
+        <w:gridCol w:w="2880"/>
+      </w:tblGrid>
+      <w:tr>
+        <w:tc>
+          <w:tcPr>
+            <w:tcW w:type="dxa" w:w="2880"/>
+          </w:tcPr>
+          <w:p>
+            <w:r>
+              <w:rPr>
+                <w:b/>
+              </w:rPr>
+              <w:t>Tipo</w:t>
+            </w:r>
+          </w:p>
+        </w:tc>
+        <w:tc>
+          <w:tcPr>
+            <w:tcW w:type="dxa" w:w="2880"/>
+          </w:tcPr>
+          <w:p>
+            <w:r>
+              <w:rPr>
+                <w:b/>
+              </w:rPr>
+              <w:t>Umbral (inclusive)</w:t>
+            </w:r>
+          </w:p>
+        </w:tc>
+        <w:tc>
+          <w:tcPr>
+            <w:tcW w:type="dxa" w:w="2880"/>
+          </w:tcPr>
+          <w:p>
+            <w:r>
+              <w:rPr>
+                <w:b/>
+              </w:rPr>
+              <w:t>Bonus</w:t>
+            </w:r>
+          </w:p>
+        </w:tc>
+      </w:tr>
+      <w:tr>
+        <w:tc>
+          <w:tcPr>
+            <w:tcW w:type="dxa" w:w="2880"/>
+          </w:tcPr>
+          <w:p>
+            <w:r>
+              <w:t>Running</w:t>
+            </w:r>
+          </w:p>
+        </w:tc>
+        <w:tc>
+          <w:tcPr>
+            <w:tcW w:type="dxa" w:w="2880"/>
+          </w:tcPr>
+          <w:p>
+            <w:r>
+              <w:t>5 km o más</w:t>
+            </w:r>
+          </w:p>
+        </w:tc>
+        <w:tc>
+          <w:tcPr>
+            <w:tcW w:type="dxa" w:w="2880"/>
+          </w:tcPr>
+          <w:p>
+            <w:r>
+              <w:t>+5</w:t>
+            </w:r>
+          </w:p>
+        </w:tc>
+      </w:tr>
+      <w:tr>
+        <w:tc>
+          <w:tcPr>
+            <w:tcW w:type="dxa" w:w="2880"/>
+          </w:tcPr>
+          <w:p>
+            <w:r>
+              <w:t>Bici</w:t>
+            </w:r>
+          </w:p>
+        </w:tc>
+        <w:tc>
+          <w:tcPr>
+            <w:tcW w:type="dxa" w:w="2880"/>
+          </w:tcPr>
+          <w:p>
+            <w:r>
+              <w:t>20 km o más</w:t>
+            </w:r>
+          </w:p>
+        </w:tc>
+        <w:tc>
+          <w:tcPr>
+            <w:tcW w:type="dxa" w:w="2880"/>
+          </w:tcPr>
+          <w:p>
+            <w:r>
+              <w:t>+5</w:t>
+            </w:r>
+          </w:p>
+        </w:tc>
+      </w:tr>
+      <w:tr>
+        <w:tc>
+          <w:tcPr>
+            <w:tcW w:type="dxa" w:w="2880"/>
+          </w:tcPr>
+          <w:p>
+            <w:r>
+              <w:t>Natación</w:t>
+            </w:r>
+          </w:p>
+        </w:tc>
+        <w:tc>
+          <w:tcPr>
+            <w:tcW w:type="dxa" w:w="2880"/>
+          </w:tcPr>
+          <w:p>
+            <w:r>
+              <w:t>2 km o más</w:t>
+            </w:r>
+          </w:p>
+        </w:tc>
+        <w:tc>
+          <w:tcPr>
+            <w:tcW w:type="dxa" w:w="2880"/>
+          </w:tcPr>
+          <w:p>
+            <w:r>
+              <w:t>+5</w:t>
+            </w:r>
+          </w:p>
+        </w:tc>
+      </w:tr>
+    </w:tbl>
+    <w:p>
+      <w:pPr>
+        <w:pStyle w:val="ListBullet"/>
+      </w:pPr>
+      <w:r>
+        <w:t>Se suma al +1 del hábito y al +5 semanal de "3 cardios en la semana"; no reemplaza nada.</w:t>
+      </w:r>
+    </w:p>
+    <w:p>
+      <w:pPr>
+        <w:pStyle w:val="ListBullet"/>
+      </w:pPr>
+      <w:r>
+        <w:rPr>
+          <w:b/>
+        </w:rPr>
+        <w:t>Máximo uno por usuario y día</w:t>
+      </w:r>
+      <w:r>
+        <w:t xml:space="preserve"> (índice único </w:t>
+      </w:r>
+      <w:r>
+        <w:rPr>
+          <w:rFonts w:ascii="Consolas" w:hAnsi="Consolas"/>
+          <w:sz w:val="18"/>
+        </w:rPr>
+        <w:t>bonus_cardio_distance_dia</w:t>
+      </w:r>
+      <w:r>
+        <w:t>). Decisión: el calendario registra una actividad cada vez que se tacha Cardio (y destachar la borra), así que en la práctica solo hay una por día; el tope evita que alguien sume +5 varias veces insertando actividades por la API.</w:t>
+      </w:r>
+    </w:p>
+    <w:p>
+      <w:pPr>
+        <w:pStyle w:val="ListBullet"/>
+      </w:pPr>
+      <w:r>
+        <w:t>Solo hoy o ayer (</w:t>
+      </w:r>
+      <w:r>
+        <w:rPr>
+          <w:rFonts w:ascii="Consolas" w:hAnsi="Consolas"/>
+          <w:sz w:val="18"/>
+        </w:rPr>
+        <w:t>is_editable_day</w:t>
+      </w:r>
+      <w:r>
+        <w:t xml:space="preserve">), dentro de la carrera, con </w:t>
+      </w:r>
+      <w:r>
+        <w:rPr>
+          <w:rFonts w:ascii="Consolas" w:hAnsi="Consolas"/>
+          <w:sz w:val="18"/>
+        </w:rPr>
+        <w:t>from_habit = true</w:t>
+      </w:r>
+      <w:r>
+        <w:t xml:space="preserve"> y con la foto de cardio de ese día ya guardada.</w:t>
+      </w:r>
+    </w:p>
+    <w:p>
+      <w:pPr>
+        <w:pStyle w:val="ListBullet"/>
+      </w:pPr>
+      <w:r>
+        <w:t xml:space="preserve">Los umbrales viven en dos lugares que deben coincidir: </w:t>
+      </w:r>
+      <w:r>
+        <w:rPr>
+          <w:rFonts w:ascii="Consolas" w:hAnsi="Consolas"/>
+          <w:sz w:val="18"/>
+        </w:rPr>
+        <w:t>CARDIO_DISTANCE_MIN_KM</w:t>
+      </w:r>
+      <w:r>
+        <w:t xml:space="preserve"> (</w:t>
+      </w:r>
+      <w:r>
+        <w:rPr>
+          <w:rFonts w:ascii="Consolas" w:hAnsi="Consolas"/>
+          <w:sz w:val="18"/>
+        </w:rPr>
+        <w:t>src/lib/constants.ts</w:t>
+      </w:r>
+      <w:r>
+        <w:t xml:space="preserve">, para la UI) y </w:t>
+      </w:r>
+      <w:r>
+        <w:rPr>
+          <w:rFonts w:ascii="Consolas" w:hAnsi="Consolas"/>
+          <w:sz w:val="18"/>
+        </w:rPr>
+        <w:t>cardio_bonus_min_km()</w:t>
+      </w:r>
+      <w:r>
+        <w:t xml:space="preserve"> (SQL, el que decide).</w:t>
+      </w:r>
+    </w:p>
+    <w:p>
+      <w:pPr>
+        <w:pStyle w:val="Heading2"/>
+      </w:pPr>
+      <w:r>
+        <w:t>9.3 Base de datos (`supabase/cardio_distancia.sql`)</w:t>
+      </w:r>
+    </w:p>
+    <w:p>
+      <w:pPr>
+        <w:pStyle w:val="ListBullet"/>
+      </w:pPr>
+      <w:r>
+        <w:rPr>
+          <w:rFonts w:ascii="Consolas" w:hAnsi="Consolas"/>
+          <w:sz w:val="18"/>
+        </w:rPr>
+        <w:t>activities.from_habit boolean default false</w:t>
+      </w:r>
+      <w:r>
+        <w:t>.</w:t>
+      </w:r>
+    </w:p>
+    <w:p>
+      <w:pPr>
+        <w:pStyle w:val="ListBullet"/>
+      </w:pPr>
+      <w:r>
+        <w:rPr>
+          <w:rFonts w:ascii="Consolas" w:hAnsi="Consolas"/>
+          <w:sz w:val="18"/>
+        </w:rPr>
+        <w:t>bonus_events</w:t>
+      </w:r>
+      <w:r>
+        <w:t xml:space="preserve">: tipo nuevo </w:t>
+      </w:r>
+      <w:r>
+        <w:rPr>
+          <w:rFonts w:ascii="Consolas" w:hAnsi="Consolas"/>
+          <w:sz w:val="18"/>
+        </w:rPr>
+        <w:t>cardio_distance</w:t>
+      </w:r>
+      <w:r>
+        <w:t xml:space="preserve">, columnas </w:t>
+      </w:r>
+      <w:r>
+        <w:rPr>
+          <w:rFonts w:ascii="Consolas" w:hAnsi="Consolas"/>
+          <w:sz w:val="18"/>
+        </w:rPr>
+        <w:t>activity_id</w:t>
+      </w:r>
+      <w:r>
+        <w:t xml:space="preserve"> (FK a </w:t>
+      </w:r>
+      <w:r>
+        <w:rPr>
+          <w:rFonts w:ascii="Consolas" w:hAnsi="Consolas"/>
+          <w:sz w:val="18"/>
+        </w:rPr>
+        <w:t>activities</w:t>
+      </w:r>
+      <w:r>
+        <w:t xml:space="preserve">, </w:t>
+      </w:r>
+      <w:r>
+        <w:rPr>
+          <w:rFonts w:ascii="Consolas" w:hAnsi="Consolas"/>
+          <w:sz w:val="18"/>
+        </w:rPr>
+        <w:t>on delete cascade</w:t>
+      </w:r>
+      <w:r>
+        <w:t xml:space="preserve">) y </w:t>
+      </w:r>
+      <w:r>
+        <w:rPr>
+          <w:rFonts w:ascii="Consolas" w:hAnsi="Consolas"/>
+          <w:sz w:val="18"/>
+        </w:rPr>
+        <w:t>activity_type</w:t>
+      </w:r>
+      <w:r>
+        <w:t xml:space="preserve">; </w:t>
+      </w:r>
+      <w:r>
+        <w:rPr>
+          <w:rFonts w:ascii="Consolas" w:hAnsi="Consolas"/>
+          <w:sz w:val="18"/>
+        </w:rPr>
+        <w:t>distance_km</w:t>
+      </w:r>
+      <w:r>
+        <w:t xml:space="preserve"> guarda los km. El check </w:t>
+      </w:r>
+      <w:r>
+        <w:rPr>
+          <w:rFonts w:ascii="Consolas" w:hAnsi="Consolas"/>
+          <w:sz w:val="18"/>
+        </w:rPr>
+        <w:t>bonus_valido</w:t>
+      </w:r>
+      <w:r>
+        <w:t xml:space="preserve"> exige </w:t>
+      </w:r>
+      <w:r>
+        <w:rPr>
+          <w:rFonts w:ascii="Consolas" w:hAnsi="Consolas"/>
+          <w:sz w:val="18"/>
+        </w:rPr>
+        <w:t>points = 5</w:t>
+      </w:r>
+      <w:r>
+        <w:t xml:space="preserve">, </w:t>
+      </w:r>
+      <w:r>
+        <w:rPr>
+          <w:rFonts w:ascii="Consolas" w:hAnsi="Consolas"/>
+          <w:sz w:val="18"/>
+        </w:rPr>
+        <w:t>activity_id</w:t>
+      </w:r>
+      <w:r>
+        <w:t xml:space="preserve"> y tipo válido.</w:t>
+      </w:r>
+    </w:p>
+    <w:p>
+      <w:pPr>
+        <w:pStyle w:val="ListBullet"/>
+      </w:pPr>
+      <w:r>
+        <w:t xml:space="preserve">La política de INSERT de </w:t>
+      </w:r>
+      <w:r>
+        <w:rPr>
+          <w:rFonts w:ascii="Consolas" w:hAnsi="Consolas"/>
+          <w:sz w:val="18"/>
+        </w:rPr>
+        <w:t>bonus_events</w:t>
+      </w:r>
+      <w:r>
+        <w:t xml:space="preserve"> solo permite </w:t>
+      </w:r>
+      <w:r>
+        <w:rPr>
+          <w:rFonts w:ascii="Consolas" w:hAnsi="Consolas"/>
+          <w:sz w:val="18"/>
+        </w:rPr>
+        <w:t>book</w:t>
+      </w:r>
+      <w:r>
+        <w:t xml:space="preserve"> y </w:t>
+      </w:r>
+      <w:r>
+        <w:rPr>
+          <w:rFonts w:ascii="Consolas" w:hAnsi="Consolas"/>
+          <w:sz w:val="18"/>
+        </w:rPr>
+        <w:t>half_marathon</w:t>
+      </w:r>
+      <w:r>
+        <w:t>: el de distancia lo crea únicamente el trigger.</w:t>
+      </w:r>
+    </w:p>
+    <w:tbl>
+      <w:tblPr>
+        <w:tblStyle w:val="TableGrid"/>
+        <w:tblW w:type="auto" w:w="0"/>
+        <w:tblLook w:firstColumn="1" w:firstRow="1" w:lastColumn="0" w:lastRow="0" w:noHBand="0" w:noVBand="1" w:val="04A0"/>
+      </w:tblPr>
+      <w:tblGrid>
+        <w:gridCol w:w="2880"/>
+        <w:gridCol w:w="2880"/>
+        <w:gridCol w:w="2880"/>
+      </w:tblGrid>
+      <w:tr>
+        <w:tc>
+          <w:tcPr>
+            <w:tcW w:type="dxa" w:w="2880"/>
+          </w:tcPr>
+          <w:p>
+            <w:r>
+              <w:rPr>
+                <w:b/>
+              </w:rPr>
+              <w:t>Trigger</w:t>
+            </w:r>
+          </w:p>
+        </w:tc>
+        <w:tc>
+          <w:tcPr>
+            <w:tcW w:type="dxa" w:w="2880"/>
+          </w:tcPr>
+          <w:p>
+            <w:r>
+              <w:rPr>
+                <w:b/>
+              </w:rPr>
+              <w:t>Tabla / evento</w:t>
+            </w:r>
+          </w:p>
+        </w:tc>
+        <w:tc>
+          <w:tcPr>
+            <w:tcW w:type="dxa" w:w="2880"/>
+          </w:tcPr>
+          <w:p>
+            <w:r>
+              <w:rPr>
+                <w:b/>
+              </w:rPr>
+              <w:t>Qué hace</w:t>
+            </w:r>
+          </w:p>
+        </w:tc>
+      </w:tr>
+      <w:tr>
+        <w:tc>
+          <w:tcPr>
+            <w:tcW w:type="dxa" w:w="2880"/>
+          </w:tcPr>
+          <w:p>
+            <w:r>
+              <w:rPr>
+                <w:rFonts w:ascii="Consolas" w:hAnsi="Consolas"/>
+                <w:sz w:val="18"/>
+              </w:rPr>
+              <w:t>activities_cardio_bonus_trigger</w:t>
+            </w:r>
+            <w:r>
+              <w:t xml:space="preserve"> → </w:t>
+            </w:r>
+            <w:r>
+              <w:rPr>
+                <w:rFonts w:ascii="Consolas" w:hAnsi="Consolas"/>
+                <w:sz w:val="18"/>
+              </w:rPr>
+              <w:t>grant_cardio_distance_bonus()</w:t>
+            </w:r>
+          </w:p>
+        </w:tc>
+        <w:tc>
+          <w:tcPr>
+            <w:tcW w:type="dxa" w:w="2880"/>
+          </w:tcPr>
+          <w:p>
+            <w:r>
+              <w:rPr>
+                <w:rFonts w:ascii="Consolas" w:hAnsi="Consolas"/>
+                <w:sz w:val="18"/>
+              </w:rPr>
+              <w:t>activities</w:t>
+            </w:r>
+            <w:r>
+              <w:t xml:space="preserve"> AFTER INSERT</w:t>
+            </w:r>
+          </w:p>
+        </w:tc>
+        <w:tc>
+          <w:tcPr>
+            <w:tcW w:type="dxa" w:w="2880"/>
+          </w:tcPr>
+          <w:p>
+            <w:r>
+              <w:t>Crea el bonus si cumple la regla 9.2</w:t>
+            </w:r>
+          </w:p>
+        </w:tc>
+      </w:tr>
+      <w:tr>
+        <w:tc>
+          <w:tcPr>
+            <w:tcW w:type="dxa" w:w="2880"/>
+          </w:tcPr>
+          <w:p>
+            <w:r>
+              <w:rPr>
+                <w:rFonts w:ascii="Consolas" w:hAnsi="Consolas"/>
+                <w:sz w:val="18"/>
+              </w:rPr>
+              <w:t>habit_checks_cardio_cleanup_trigger</w:t>
+            </w:r>
+            <w:r>
+              <w:t xml:space="preserve"> → </w:t>
+            </w:r>
+            <w:r>
+              <w:rPr>
+                <w:rFonts w:ascii="Consolas" w:hAnsi="Consolas"/>
+                <w:sz w:val="18"/>
+              </w:rPr>
+              <w:t>remove_cardio_habit_activities()</w:t>
+            </w:r>
+          </w:p>
+        </w:tc>
+        <w:tc>
+          <w:tcPr>
+            <w:tcW w:type="dxa" w:w="2880"/>
+          </w:tcPr>
+          <w:p>
+            <w:r>
+              <w:rPr>
+                <w:rFonts w:ascii="Consolas" w:hAnsi="Consolas"/>
+                <w:sz w:val="18"/>
+              </w:rPr>
+              <w:t>habit_checks</w:t>
+            </w:r>
+            <w:r>
+              <w:t xml:space="preserve"> AFTER DELETE</w:t>
+            </w:r>
+          </w:p>
+        </w:tc>
+        <w:tc>
+          <w:tcPr>
+            <w:tcW w:type="dxa" w:w="2880"/>
+          </w:tcPr>
+          <w:p>
+            <w:r>
+              <w:t xml:space="preserve">Al destachar Cardio borra las actividades </w:t>
+            </w:r>
+            <w:r>
+              <w:rPr>
+                <w:rFonts w:ascii="Consolas" w:hAnsi="Consolas"/>
+                <w:sz w:val="18"/>
+              </w:rPr>
+              <w:t>from_habit</w:t>
+            </w:r>
+            <w:r>
+              <w:t xml:space="preserve"> de ese día; su bonus se va por cascade</w:t>
+            </w:r>
+          </w:p>
+        </w:tc>
+      </w:tr>
+      <w:tr>
+        <w:tc>
+          <w:tcPr>
+            <w:tcW w:type="dxa" w:w="2880"/>
+          </w:tcPr>
+          <w:p>
+            <w:r>
+              <w:rPr>
+                <w:rFonts w:ascii="Consolas" w:hAnsi="Consolas"/>
+                <w:sz w:val="18"/>
+              </w:rPr>
+              <w:t>announce_bonus_trigger</w:t>
+            </w:r>
+            <w:r>
+              <w:t xml:space="preserve"> (actualizado)</w:t>
+            </w:r>
+          </w:p>
+        </w:tc>
+        <w:tc>
+          <w:tcPr>
+            <w:tcW w:type="dxa" w:w="2880"/>
+          </w:tcPr>
+          <w:p>
+            <w:r>
+              <w:rPr>
+                <w:rFonts w:ascii="Consolas" w:hAnsi="Consolas"/>
+                <w:sz w:val="18"/>
+              </w:rPr>
+              <w:t>bonus_events</w:t>
+            </w:r>
+            <w:r>
+              <w:t xml:space="preserve"> AFTER INSERT</w:t>
+            </w:r>
+          </w:p>
+        </w:tc>
+        <w:tc>
+          <w:tcPr>
+            <w:tcW w:type="dxa" w:w="2880"/>
+          </w:tcPr>
+          <w:p>
+            <w:r>
+              <w:t>"🏃 X corrió 6km…", "🚴 X rodó 25km en bici…" o "🏊 X nadó 2.5km…" + "…y ganó un bonus de +5 pts"</w:t>
+            </w:r>
+          </w:p>
+        </w:tc>
+      </w:tr>
+      <w:tr>
+        <w:tc>
+          <w:tcPr>
+            <w:tcW w:type="dxa" w:w="2880"/>
+          </w:tcPr>
+          <w:p>
+            <w:r>
+              <w:rPr>
+                <w:rFonts w:ascii="Consolas" w:hAnsi="Consolas"/>
+                <w:sz w:val="18"/>
+              </w:rPr>
+              <w:t>announce_activity_trigger</w:t>
+            </w:r>
+            <w:r>
+              <w:t xml:space="preserve"> (actualizado)</w:t>
+            </w:r>
+          </w:p>
+        </w:tc>
+        <w:tc>
+          <w:tcPr>
+            <w:tcW w:type="dxa" w:w="2880"/>
+          </w:tcPr>
+          <w:p>
+            <w:r>
+              <w:rPr>
+                <w:rFonts w:ascii="Consolas" w:hAnsi="Consolas"/>
+                <w:sz w:val="18"/>
+              </w:rPr>
+              <w:t>activities</w:t>
+            </w:r>
+            <w:r>
+              <w:t xml:space="preserve"> AFTER INSERT</w:t>
+            </w:r>
+          </w:p>
+        </w:tc>
+        <w:tc>
+          <w:tcPr>
+            <w:tcW w:type="dxa" w:w="2880"/>
+          </w:tcPr>
+          <w:p>
+            <w:r>
+              <w:t>Igual que antes (cardio &gt; 3 km o &gt; 20 min), pero no publica si esa actividad ya ganó el bonus, para no repetir el mensaje</w:t>
+            </w:r>
+          </w:p>
+        </w:tc>
+      </w:tr>
+    </w:tbl>
+    <w:p>
+      <w:r>
+        <w:t xml:space="preserve">El trigger del bonus se llama </w:t>
+      </w:r>
+      <w:r>
+        <w:rPr>
+          <w:rFonts w:ascii="Consolas" w:hAnsi="Consolas"/>
+          <w:sz w:val="18"/>
+        </w:rPr>
+        <w:t>activities_…</w:t>
+      </w:r>
+      <w:r>
+        <w:t xml:space="preserve"> a propósito: Postgres corre los triggers del mismo evento en orden alfabético y debe ir antes que </w:t>
+      </w:r>
+      <w:r>
+        <w:rPr>
+          <w:rFonts w:ascii="Consolas" w:hAnsi="Consolas"/>
+          <w:sz w:val="18"/>
+        </w:rPr>
+        <w:t>announce_activity_trigger</w:t>
+      </w:r>
+      <w:r>
+        <w:t>.</w:t>
+      </w:r>
+    </w:p>
+    <w:p>
+      <w:r>
+        <w:t xml:space="preserve">Los puntos no necesitan más cambios: la vista </w:t>
+      </w:r>
+      <w:r>
+        <w:rPr>
+          <w:rFonts w:ascii="Consolas" w:hAnsi="Consolas"/>
+          <w:sz w:val="18"/>
+        </w:rPr>
+        <w:t>leaderboard</w:t>
+      </w:r>
+      <w:r>
+        <w:t xml:space="preserve">, </w:t>
+      </w:r>
+      <w:r>
+        <w:rPr>
+          <w:rFonts w:ascii="Consolas" w:hAnsi="Consolas"/>
+          <w:sz w:val="18"/>
+        </w:rPr>
+        <w:t>points.ts</w:t>
+      </w:r>
+      <w:r>
+        <w:t xml:space="preserve">, el banner diario y el ranking ya suman cualquier fila de </w:t>
+      </w:r>
+      <w:r>
+        <w:rPr>
+          <w:rFonts w:ascii="Consolas" w:hAnsi="Consolas"/>
+          <w:sz w:val="18"/>
+        </w:rPr>
+        <w:t>bonus_events</w:t>
+      </w:r>
+      <w:r>
+        <w:t>. En el perfil público, las actividades con bonus muestran "+5"; en el chat, 🚴 y 🏊 tienen su ícono (</w:t>
+      </w:r>
+      <w:r>
+        <w:rPr>
+          <w:rFonts w:ascii="Consolas" w:hAnsi="Consolas"/>
+          <w:sz w:val="18"/>
+        </w:rPr>
+        <w:t>SYSTEM_ICONS</w:t>
+      </w:r>
+      <w:r>
+        <w:t>).</w:t>
+      </w:r>
+    </w:p>
+    <w:p>
+      <w:pPr>
+        <w:pStyle w:val="Heading2"/>
+      </w:pPr>
+      <w:r>
+        <w:t>9.4 UI en el panel del día</w:t>
+      </w:r>
+    </w:p>
+    <w:p>
+      <w:r>
+        <w:t>Debajo de "Terminé un libro (+5)" y "Corrí 21 km (+50)" hay una nota sin botón: "Cardio: +5 pts extra si corres 5 km+, 20 km+ en bici o 2 km+ nadando. Se suma solo al tachar Cardio con tus km."</w:t>
+      </w:r>
+    </w:p>
+    <w:p>
+      <w:pPr>
+        <w:pStyle w:val="Heading1"/>
+      </w:pPr>
+      <w:r>
+        <w:t>10. Casino: cómo se mueve el saldo (blindaje)</w:t>
+      </w:r>
+    </w:p>
+    <w:p>
+      <w:pPr>
+        <w:pStyle w:val="Heading2"/>
+      </w:pPr>
+      <w:r>
+        <w:t>10.1 Regla general</w:t>
       </w:r>
     </w:p>
     <w:p>
@@ -3447,7 +4486,7 @@
         <w:pStyle w:val="Heading2"/>
       </w:pPr>
       <w:r>
-        <w:t>9.2 Rondas (`casino_rounds`)</w:t>
+        <w:t>10.2 Rondas (`casino_rounds`)</w:t>
       </w:r>
     </w:p>
     <w:p>
@@ -3728,7 +4767,7 @@
         <w:pStyle w:val="Heading2"/>
       </w:pPr>
       <w:r>
-        <w:t>9.3 Quiebra de verdad</w:t>
+        <w:t>10.3 Quiebra de verdad</w:t>
       </w:r>
     </w:p>
     <w:p>
@@ -3777,7 +4816,7 @@
         <w:pStyle w:val="Heading2"/>
       </w:pPr>
       <w:r>
-        <w:t>9.4 Carreras y repeticiones</w:t>
+        <w:t>10.4 Carreras y repeticiones</w:t>
       </w:r>
     </w:p>
     <w:p>
@@ -3884,7 +4923,7 @@
         <w:pStyle w:val="Heading2"/>
       </w:pPr>
       <w:r>
-        <w:t>9.5 Auditoría</w:t>
+        <w:t>10.5 Auditoría</w:t>
       </w:r>
     </w:p>
     <w:p>
@@ -4080,7 +5119,7 @@
         <w:pStyle w:val="Heading2"/>
       </w:pPr>
       <w:r>
-        <w:t>9.6 Pendiente fuera del casino</w:t>
+        <w:t>10.6 Pendiente fuera del casino</w:t>
       </w:r>
     </w:p>
     <w:p>
@@ -4110,7 +5149,7 @@
         <w:pStyle w:val="Heading1"/>
       </w:pPr>
       <w:r>
-        <w:t>10. Seguridad (resumen)</w:t>
+        <w:t>11. Seguridad (resumen)</w:t>
       </w:r>
     </w:p>
     <w:p>
@@ -4146,7 +5185,7 @@
         <w:pStyle w:val="ListBullet"/>
       </w:pPr>
       <w:r>
-        <w:t>Casino: resultados y premios solo en el servidor, pagos atados a rondas con tope por juego, auditoría de saldos (sección 9).</w:t>
+        <w:t>Casino: resultados y premios solo en el servidor, pagos atados a rondas con tope por juego, auditoría de saldos (sección 10).</w:t>
       </w:r>
     </w:p>
     <w:p>
@@ -4200,7 +5239,7 @@
         <w:pStyle w:val="Heading1"/>
       </w:pPr>
       <w:r>
-        <w:t>11. Cómo correr</w:t>
+        <w:t>12. Cómo correr</w:t>
       </w:r>
     </w:p>
     <w:p>

</xml_diff>

<commit_message>
Fix Kevincito: borrar peseis, bloquear compra, limpiar adjustment
</commit_message>
<xml_diff>
--- a/DOCUMENTACION_ARQUITECTURA_COMPLETA.docx
+++ b/DOCUMENTACION_ARQUITECTURA_COMPLETA.docx
@@ -100,6 +100,100 @@
       </w:pPr>
       <w:r>
         <w:t>CHANGELOG</w:t>
+      </w:r>
+    </w:p>
+    <w:p>
+      <w:pPr>
+        <w:pStyle w:val="ListBullet"/>
+      </w:pPr>
+      <w:r>
+        <w:t xml:space="preserve">2026-10-07 — </w:t>
+      </w:r>
+      <w:r>
+        <w:rPr>
+          <w:b/>
+        </w:rPr>
+        <w:t>Kevincito: puntos corregidos y compra de peseis bloqueada</w:t>
+      </w:r>
+      <w:r>
+        <w:t xml:space="preserve"> (</w:t>
+      </w:r>
+      <w:r>
+        <w:rPr>
+          <w:rFonts w:ascii="Consolas" w:hAnsi="Consolas"/>
+          <w:sz w:val="18"/>
+        </w:rPr>
+        <w:t>supabase/kevincito_fix.sql</w:t>
+      </w:r>
+      <w:r>
+        <w:t xml:space="preserve">). Se borró su ajuste de +17 y todas sus transacciones </w:t>
+      </w:r>
+      <w:r>
+        <w:rPr>
+          <w:rFonts w:ascii="Consolas" w:hAnsi="Consolas"/>
+          <w:sz w:val="18"/>
+        </w:rPr>
+        <w:t>buy_peseis</w:t>
+      </w:r>
+      <w:r>
+        <w:t xml:space="preserve">, así que sus 22 puntos de hábitos vuelven a verse completos en el ranking y las gráficas (conserva los peseis que ya tenía). Además </w:t>
+      </w:r>
+      <w:r>
+        <w:rPr>
+          <w:rFonts w:ascii="Consolas" w:hAnsi="Consolas"/>
+          <w:sz w:val="18"/>
+        </w:rPr>
+        <w:t>casino_buy_peseis()</w:t>
+      </w:r>
+      <w:r>
+        <w:t xml:space="preserve"> rechaza solo a su </w:t>
+      </w:r>
+      <w:r>
+        <w:rPr>
+          <w:rFonts w:ascii="Consolas" w:hAnsi="Consolas"/>
+          <w:sz w:val="18"/>
+        </w:rPr>
+        <w:t>user_id</w:t>
+      </w:r>
+      <w:r>
+        <w:t xml:space="preserve"> con el mensaje "No puedes gastar tus puntos de hábitos en el casino, eres un pobre pendejo Kevin"; el resto del casino sigue igual para él. Ver sección 14.</w:t>
+      </w:r>
+    </w:p>
+    <w:p>
+      <w:pPr>
+        <w:pStyle w:val="ListBullet"/>
+      </w:pPr>
+      <w:r>
+        <w:t xml:space="preserve">2026-10-07 — </w:t>
+      </w:r>
+      <w:r>
+        <w:rPr>
+          <w:b/>
+        </w:rPr>
+        <w:t>Documentado: ajustes de puntos, override de admin y cardio "Otros"</w:t>
+      </w:r>
+      <w:r>
+        <w:t xml:space="preserve"> (ya estaban en el código desde el 2026-10-05, sin documentar). Investigación de "los 17 puntos de Kevincito no aparecen": en el código no hay ningún filtro por </w:t>
+      </w:r>
+      <w:r>
+        <w:rPr>
+          <w:rFonts w:ascii="Consolas" w:hAnsi="Consolas"/>
+          <w:sz w:val="18"/>
+        </w:rPr>
+        <w:t>type</w:t>
+      </w:r>
+      <w:r>
+        <w:t xml:space="preserve"> que excluya </w:t>
+      </w:r>
+      <w:r>
+        <w:rPr>
+          <w:rFonts w:ascii="Consolas" w:hAnsi="Consolas"/>
+          <w:sz w:val="18"/>
+        </w:rPr>
+        <w:t>adjustment</w:t>
+      </w:r>
+      <w:r>
+        <w:t>; ver sección 13.</w:t>
       </w:r>
     </w:p>
     <w:p>
@@ -1336,6 +1430,72 @@
     </w:p>
     <w:p>
       <w:pPr>
+        <w:pStyle w:val="ListNumber"/>
+      </w:pPr>
+      <w:r>
+        <w:rPr>
+          <w:b/>
+        </w:rPr>
+        <w:t>`ajustes_puntos.sql`</w:t>
+      </w:r>
+      <w:r>
+        <w:t xml:space="preserve">, </w:t>
+      </w:r>
+      <w:r>
+        <w:rPr>
+          <w:b/>
+        </w:rPr>
+        <w:t>`admin_override_backfill.sql`</w:t>
+      </w:r>
+      <w:r>
+        <w:t xml:space="preserve">, </w:t>
+      </w:r>
+      <w:r>
+        <w:rPr>
+          <w:b/>
+        </w:rPr>
+        <w:t>`cardio_otros.sql`</w:t>
+      </w:r>
+      <w:r>
+        <w:t xml:space="preserve"> — ver sección 13. Se pueden repetir; corren después de </w:t>
+      </w:r>
+      <w:r>
+        <w:rPr>
+          <w:rFonts w:ascii="Consolas" w:hAnsi="Consolas"/>
+          <w:sz w:val="18"/>
+        </w:rPr>
+        <w:t>cardio_distancia.sql</w:t>
+      </w:r>
+      <w:r>
+        <w:t>.</w:t>
+      </w:r>
+    </w:p>
+    <w:p>
+      <w:pPr>
+        <w:pStyle w:val="ListNumber"/>
+      </w:pPr>
+      <w:r>
+        <w:rPr>
+          <w:b/>
+        </w:rPr>
+        <w:t>`kevincito_fix.sql`</w:t>
+      </w:r>
+      <w:r>
+        <w:t xml:space="preserve"> — limpieza de datos y bloqueo de compra de peseis para un usuario (ver sección 14). Se puede repetir; corre después de </w:t>
+      </w:r>
+      <w:r>
+        <w:rPr>
+          <w:rFonts w:ascii="Consolas" w:hAnsi="Consolas"/>
+          <w:sz w:val="18"/>
+        </w:rPr>
+        <w:t>casino_blindaje.sql</w:t>
+      </w:r>
+      <w:r>
+        <w:t>.</w:t>
+      </w:r>
+    </w:p>
+    <w:p>
+      <w:pPr>
         <w:pStyle w:val="Heading1"/>
       </w:pPr>
       <w:r>
@@ -5330,6 +5490,573 @@
         <w:t xml:space="preserve"> → http://localhost:3000</w:t>
       </w:r>
     </w:p>
+    <w:p>
+      <w:pPr>
+        <w:pStyle w:val="Heading1"/>
+      </w:pPr>
+      <w:r>
+        <w:t>13. Ajustes de puntos (`supabase/ajustes_puntos.sql`)</w:t>
+      </w:r>
+    </w:p>
+    <w:p>
+      <w:pPr>
+        <w:pStyle w:val="ListBullet"/>
+      </w:pPr>
+      <w:r>
+        <w:rPr>
+          <w:rFonts w:ascii="Consolas" w:hAnsi="Consolas"/>
+          <w:sz w:val="18"/>
+        </w:rPr>
+        <w:t>bonus_events.type = 'adjustment'</w:t>
+      </w:r>
+      <w:r>
+        <w:t xml:space="preserve"> + columna </w:t>
+      </w:r>
+      <w:r>
+        <w:rPr>
+          <w:rFonts w:ascii="Consolas" w:hAnsi="Consolas"/>
+          <w:sz w:val="18"/>
+        </w:rPr>
+        <w:t>label</w:t>
+      </w:r>
+      <w:r>
+        <w:t>: el admin suma o resta puntos reales a cualquiera (</w:t>
+      </w:r>
+      <w:r>
+        <w:rPr>
+          <w:rFonts w:ascii="Consolas" w:hAnsi="Consolas"/>
+          <w:sz w:val="18"/>
+        </w:rPr>
+        <w:t>points &lt;&gt; 0</w:t>
+      </w:r>
+      <w:r>
+        <w:t xml:space="preserve">, </w:t>
+      </w:r>
+      <w:r>
+        <w:rPr>
+          <w:rFonts w:ascii="Consolas" w:hAnsi="Consolas"/>
+          <w:sz w:val="18"/>
+        </w:rPr>
+        <w:t>label</w:t>
+      </w:r>
+      <w:r>
+        <w:t xml:space="preserve"> obligatorio). Solo el admin (</w:t>
+      </w:r>
+      <w:r>
+        <w:rPr>
+          <w:rFonts w:ascii="Consolas" w:hAnsi="Consolas"/>
+          <w:sz w:val="18"/>
+        </w:rPr>
+        <w:t>is_app_admin()</w:t>
+      </w:r>
+      <w:r>
+        <w:t>) puede insertarlos; libro y medio maratón siguen siendo de cada quien.</w:t>
+      </w:r>
+    </w:p>
+    <w:p>
+      <w:pPr>
+        <w:pStyle w:val="ListBullet"/>
+      </w:pPr>
+      <w:r>
+        <w:t>El script ya no inserta ningún ajuste. (El +17 de Kevincito que traía se retiró el 2026-10-07; ver sección 14.)</w:t>
+      </w:r>
+    </w:p>
+    <w:p>
+      <w:pPr>
+        <w:pStyle w:val="ListBullet"/>
+      </w:pPr>
+      <w:r>
+        <w:rPr>
+          <w:b/>
+        </w:rPr>
+        <w:t>Dónde se suman</w:t>
+      </w:r>
+      <w:r>
+        <w:t xml:space="preserve"> (ninguno filtra por </w:t>
+      </w:r>
+      <w:r>
+        <w:rPr>
+          <w:rFonts w:ascii="Consolas" w:hAnsi="Consolas"/>
+          <w:sz w:val="18"/>
+        </w:rPr>
+        <w:t>type</w:t>
+      </w:r>
+      <w:r>
+        <w:t xml:space="preserve">): vista </w:t>
+      </w:r>
+      <w:r>
+        <w:rPr>
+          <w:rFonts w:ascii="Consolas" w:hAnsi="Consolas"/>
+          <w:sz w:val="18"/>
+        </w:rPr>
+        <w:t>leaderboard</w:t>
+      </w:r>
+      <w:r>
+        <w:t xml:space="preserve"> (</w:t>
+      </w:r>
+      <w:r>
+        <w:rPr>
+          <w:rFonts w:ascii="Consolas" w:hAnsi="Consolas"/>
+          <w:sz w:val="18"/>
+        </w:rPr>
+        <w:t>sum(points)</w:t>
+      </w:r>
+      <w:r>
+        <w:t xml:space="preserve"> de todo </w:t>
+      </w:r>
+      <w:r>
+        <w:rPr>
+          <w:rFonts w:ascii="Consolas" w:hAnsi="Consolas"/>
+          <w:sz w:val="18"/>
+        </w:rPr>
+        <w:t>bonus_events</w:t>
+      </w:r>
+      <w:r>
+        <w:t xml:space="preserve">), </w:t>
+      </w:r>
+      <w:r>
+        <w:rPr>
+          <w:rFonts w:ascii="Consolas" w:hAnsi="Consolas"/>
+          <w:sz w:val="18"/>
+        </w:rPr>
+        <w:t>useRanking</w:t>
+      </w:r>
+      <w:r>
+        <w:t xml:space="preserve"> (</w:t>
+      </w:r>
+      <w:r>
+        <w:rPr>
+          <w:rFonts w:ascii="Consolas" w:hAnsi="Consolas"/>
+          <w:sz w:val="18"/>
+        </w:rPr>
+        <w:t>select *</w:t>
+      </w:r>
+      <w:r>
+        <w:t xml:space="preserve"> con </w:t>
+      </w:r>
+      <w:r>
+        <w:rPr>
+          <w:rFonts w:ascii="Consolas" w:hAnsi="Consolas"/>
+          <w:sz w:val="18"/>
+        </w:rPr>
+        <w:t>date</w:t>
+      </w:r>
+      <w:r>
+        <w:t xml:space="preserve"> entre </w:t>
+      </w:r>
+      <w:r>
+        <w:rPr>
+          <w:rFonts w:ascii="Consolas" w:hAnsi="Consolas"/>
+          <w:sz w:val="18"/>
+        </w:rPr>
+        <w:t>COMPETITION_START</w:t>
+      </w:r>
+      <w:r>
+        <w:t xml:space="preserve"> y </w:t>
+      </w:r>
+      <w:r>
+        <w:rPr>
+          <w:rFonts w:ascii="Consolas" w:hAnsi="Consolas"/>
+          <w:sz w:val="18"/>
+        </w:rPr>
+        <w:t>COMPETITION_END</w:t>
+      </w:r>
+      <w:r>
+        <w:t xml:space="preserve">), </w:t>
+      </w:r>
+      <w:r>
+        <w:rPr>
+          <w:rFonts w:ascii="Consolas" w:hAnsi="Consolas"/>
+          <w:sz w:val="18"/>
+        </w:rPr>
+        <w:t>useMyData</w:t>
+      </w:r>
+      <w:r>
+        <w:t xml:space="preserve">, perfil público, </w:t>
+      </w:r>
+      <w:r>
+        <w:rPr>
+          <w:rFonts w:ascii="Consolas" w:hAnsi="Consolas"/>
+          <w:sz w:val="18"/>
+        </w:rPr>
+        <w:t>DailyBanner</w:t>
+      </w:r>
+      <w:r>
+        <w:t xml:space="preserve">. El ajuste se muestra con su </w:t>
+      </w:r>
+      <w:r>
+        <w:rPr>
+          <w:rFonts w:ascii="Consolas" w:hAnsi="Consolas"/>
+          <w:sz w:val="18"/>
+        </w:rPr>
+        <w:t>label</w:t>
+      </w:r>
+      <w:r>
+        <w:t xml:space="preserve"> en "Mis bonus" (</w:t>
+      </w:r>
+      <w:r>
+        <w:rPr>
+          <w:rFonts w:ascii="Consolas" w:hAnsi="Consolas"/>
+          <w:sz w:val="18"/>
+        </w:rPr>
+        <w:t>calendario/page.tsx</w:t>
+      </w:r>
+      <w:r>
+        <w:t>).</w:t>
+      </w:r>
+    </w:p>
+    <w:p>
+      <w:pPr>
+        <w:pStyle w:val="ListBullet"/>
+      </w:pPr>
+      <w:r>
+        <w:rPr>
+          <w:b/>
+        </w:rPr>
+        <w:t>Los puntos gastados en peseis</w:t>
+      </w:r>
+      <w:r>
+        <w:t xml:space="preserve"> (</w:t>
+      </w:r>
+      <w:r>
+        <w:rPr>
+          <w:rFonts w:ascii="Consolas" w:hAnsi="Consolas"/>
+          <w:sz w:val="18"/>
+        </w:rPr>
+        <w:t>casino_transactions.points_cost</w:t>
+      </w:r>
+      <w:r>
+        <w:t>, 1 por compra) se restan en la vista y en el front (</w:t>
+      </w:r>
+      <w:r>
+        <w:rPr>
+          <w:rFonts w:ascii="Consolas" w:hAnsi="Consolas"/>
+          <w:sz w:val="18"/>
+        </w:rPr>
+        <w:t>fetchSpentPoints</w:t>
+      </w:r>
+      <w:r>
+        <w:t>, fechados el día de la compra). Un reembolso de N puntos solo *compensa* esa resta: el total vuelve a lo que era antes de comprar, no sube N sobre eso.</w:t>
+      </w:r>
+    </w:p>
+    <w:p>
+      <w:pPr>
+        <w:pStyle w:val="ListBullet"/>
+      </w:pPr>
+      <w:r>
+        <w:t xml:space="preserve">Un ajuste con </w:t>
+      </w:r>
+      <w:r>
+        <w:rPr>
+          <w:rFonts w:ascii="Consolas" w:hAnsi="Consolas"/>
+          <w:sz w:val="18"/>
+        </w:rPr>
+        <w:t>date</w:t>
+      </w:r>
+      <w:r>
+        <w:t xml:space="preserve"> fuera del 2026-10-01…2026-12-31 cuenta en </w:t>
+      </w:r>
+      <w:r>
+        <w:rPr>
+          <w:rFonts w:ascii="Consolas" w:hAnsi="Consolas"/>
+          <w:sz w:val="18"/>
+        </w:rPr>
+        <w:t>leaderboard</w:t>
+      </w:r>
+      <w:r>
+        <w:t xml:space="preserve"> pero NO en las gráficas.</w:t>
+      </w:r>
+    </w:p>
+    <w:p>
+      <w:r>
+        <w:t xml:space="preserve">Otros scripts del 2026-10-05: </w:t>
+      </w:r>
+      <w:r>
+        <w:rPr>
+          <w:rFonts w:ascii="Consolas" w:hAnsi="Consolas"/>
+          <w:sz w:val="18"/>
+        </w:rPr>
+        <w:t>admin_override_backfill.sql</w:t>
+      </w:r>
+      <w:r>
+        <w:t xml:space="preserve"> (el admin puede tachar sus propios hábitos de cualquier día solo el 05 y 06 de octubre; bitácora en </w:t>
+      </w:r>
+      <w:r>
+        <w:rPr>
+          <w:rFonts w:ascii="Consolas" w:hAnsi="Consolas"/>
+          <w:sz w:val="18"/>
+        </w:rPr>
+        <w:t>admin_overrides_log</w:t>
+      </w:r>
+      <w:r>
+        <w:t xml:space="preserve">; </w:t>
+      </w:r>
+      <w:r>
+        <w:rPr>
+          <w:rFonts w:ascii="Consolas" w:hAnsi="Consolas"/>
+          <w:sz w:val="18"/>
+        </w:rPr>
+        <w:t>ADMIN_OVERRIDE_DAYS</w:t>
+      </w:r>
+      <w:r>
+        <w:t xml:space="preserve"> en </w:t>
+      </w:r>
+      <w:r>
+        <w:rPr>
+          <w:rFonts w:ascii="Consolas" w:hAnsi="Consolas"/>
+          <w:sz w:val="18"/>
+        </w:rPr>
+        <w:t>constants.ts</w:t>
+      </w:r>
+      <w:r>
+        <w:t xml:space="preserve"> debe coincidir con </w:t>
+      </w:r>
+      <w:r>
+        <w:rPr>
+          <w:rFonts w:ascii="Consolas" w:hAnsi="Consolas"/>
+          <w:sz w:val="18"/>
+        </w:rPr>
+        <w:t>is_admin_override_day()</w:t>
+      </w:r>
+      <w:r>
+        <w:t xml:space="preserve">) y </w:t>
+      </w:r>
+      <w:r>
+        <w:rPr>
+          <w:rFonts w:ascii="Consolas" w:hAnsi="Consolas"/>
+          <w:sz w:val="18"/>
+        </w:rPr>
+        <w:t>cardio_otros.sql</w:t>
+      </w:r>
+      <w:r>
+        <w:t xml:space="preserve"> (Cardio "Otros": foto + minutos + descripción, sin km ni bonus).</w:t>
+      </w:r>
+    </w:p>
+    <w:p>
+      <w:pPr>
+        <w:pStyle w:val="Heading1"/>
+      </w:pPr>
+      <w:r>
+        <w:t>14. Kevincito: limpieza y bloqueo de compra de peseis (`supabase/kevincito_fix.sql`)</w:t>
+      </w:r>
+    </w:p>
+    <w:p>
+      <w:r>
+        <w:t xml:space="preserve">Usuario: </w:t>
+      </w:r>
+      <w:r>
+        <w:rPr>
+          <w:rFonts w:ascii="Consolas" w:hAnsi="Consolas"/>
+          <w:sz w:val="18"/>
+        </w:rPr>
+        <w:t>b1c3ff4c-9a4b-4352-be68-cccef4ad7db2</w:t>
+      </w:r>
+      <w:r>
+        <w:t xml:space="preserve"> ("Kevincito tontito cabezoncito").</w:t>
+      </w:r>
+    </w:p>
+    <w:p>
+      <w:pPr>
+        <w:pStyle w:val="ListBullet"/>
+      </w:pPr>
+      <w:r>
+        <w:rPr>
+          <w:b/>
+        </w:rPr>
+        <w:t>Datos:</w:t>
+      </w:r>
+      <w:r>
+        <w:t xml:space="preserve"> borra su </w:t>
+      </w:r>
+      <w:r>
+        <w:rPr>
+          <w:rFonts w:ascii="Consolas" w:hAnsi="Consolas"/>
+          <w:sz w:val="18"/>
+        </w:rPr>
+        <w:t>bonus_events</w:t>
+      </w:r>
+      <w:r>
+        <w:t xml:space="preserve"> de tipo </w:t>
+      </w:r>
+      <w:r>
+        <w:rPr>
+          <w:rFonts w:ascii="Consolas" w:hAnsi="Consolas"/>
+          <w:sz w:val="18"/>
+        </w:rPr>
+        <w:t>adjustment</w:t>
+      </w:r>
+      <w:r>
+        <w:t xml:space="preserve"> (+17) y todas sus </w:t>
+      </w:r>
+      <w:r>
+        <w:rPr>
+          <w:rFonts w:ascii="Consolas" w:hAnsi="Consolas"/>
+          <w:sz w:val="18"/>
+        </w:rPr>
+        <w:t>casino_transactions</w:t>
+      </w:r>
+      <w:r>
+        <w:t xml:space="preserve"> de tipo </w:t>
+      </w:r>
+      <w:r>
+        <w:rPr>
+          <w:rFonts w:ascii="Consolas" w:hAnsi="Consolas"/>
+          <w:sz w:val="18"/>
+        </w:rPr>
+        <w:t>buy_peseis</w:t>
+      </w:r>
+      <w:r>
+        <w:t xml:space="preserve">. La vista </w:t>
+      </w:r>
+      <w:r>
+        <w:rPr>
+          <w:rFonts w:ascii="Consolas" w:hAnsi="Consolas"/>
+          <w:sz w:val="18"/>
+        </w:rPr>
+        <w:t>leaderboard</w:t>
+      </w:r>
+      <w:r>
+        <w:t xml:space="preserve"> y </w:t>
+      </w:r>
+      <w:r>
+        <w:rPr>
+          <w:rFonts w:ascii="Consolas" w:hAnsi="Consolas"/>
+          <w:sz w:val="18"/>
+        </w:rPr>
+        <w:t>fetchSpentPoints</w:t>
+      </w:r>
+      <w:r>
+        <w:t xml:space="preserve"> (que lee esas transacciones) dejan de restarle puntos: quedan sus 22 puntos de hábitos, día a día en la gráfica. NO se toca </w:t>
+      </w:r>
+      <w:r>
+        <w:rPr>
+          <w:rFonts w:ascii="Consolas" w:hAnsi="Consolas"/>
+          <w:sz w:val="18"/>
+        </w:rPr>
+        <w:t>casino_balance</w:t>
+      </w:r>
+      <w:r>
+        <w:t xml:space="preserve">, así que conserva sus peseis. Consecuencia para la auditoría (10.5): su saldo ya no cuadra con </w:t>
+      </w:r>
+      <w:r>
+        <w:rPr>
+          <w:rFonts w:ascii="Consolas" w:hAnsi="Consolas"/>
+          <w:sz w:val="18"/>
+        </w:rPr>
+        <w:t>10,000 + suma de amount</w:t>
+      </w:r>
+      <w:r>
+        <w:t>, por esas compras borradas.</w:t>
+      </w:r>
+    </w:p>
+    <w:p>
+      <w:pPr>
+        <w:pStyle w:val="ListBullet"/>
+      </w:pPr>
+      <w:r>
+        <w:rPr>
+          <w:b/>
+        </w:rPr>
+        <w:t>Bloqueo:</w:t>
+      </w:r>
+      <w:r>
+        <w:t xml:space="preserve"> </w:t>
+      </w:r>
+      <w:r>
+        <w:rPr>
+          <w:rFonts w:ascii="Consolas" w:hAnsi="Consolas"/>
+          <w:sz w:val="18"/>
+        </w:rPr>
+        <w:t>casino_buy_peseis()</w:t>
+      </w:r>
+      <w:r>
+        <w:t xml:space="preserve"> revisa </w:t>
+      </w:r>
+      <w:r>
+        <w:rPr>
+          <w:rFonts w:ascii="Consolas" w:hAnsi="Consolas"/>
+          <w:sz w:val="18"/>
+        </w:rPr>
+        <w:t>auth.uid()</w:t>
+      </w:r>
+      <w:r>
+        <w:t xml:space="preserve"> al inicio y, si es ese usuario, lanza "No puedes gastar tus puntos de hábitos en el casino, eres un pobre pendejo Kevin". El </w:t>
+      </w:r>
+      <w:r>
+        <w:rPr>
+          <w:rFonts w:ascii="Consolas" w:hAnsi="Consolas"/>
+          <w:sz w:val="18"/>
+        </w:rPr>
+        <w:t>user_id</w:t>
+      </w:r>
+      <w:r>
+        <w:t xml:space="preserve"> está escrito en la función, en </w:t>
+      </w:r>
+      <w:r>
+        <w:rPr>
+          <w:rFonts w:ascii="Consolas" w:hAnsi="Consolas"/>
+          <w:sz w:val="18"/>
+        </w:rPr>
+        <w:t>kevincito_fix.sql</w:t>
+      </w:r>
+      <w:r>
+        <w:t xml:space="preserve"> y en </w:t>
+      </w:r>
+      <w:r>
+        <w:rPr>
+          <w:rFonts w:ascii="Consolas" w:hAnsi="Consolas"/>
+          <w:sz w:val="18"/>
+        </w:rPr>
+        <w:t>casino_blindaje.sql</w:t>
+      </w:r>
+      <w:r>
+        <w:t xml:space="preserve"> (para que volver a correr el blindaje no quite el bloqueo). Los demás usuarios compran igual; Kevincito sigue jugando, apostando y comprando poderes.</w:t>
+      </w:r>
+    </w:p>
+    <w:p>
+      <w:pPr>
+        <w:pStyle w:val="ListBullet"/>
+      </w:pPr>
+      <w:r>
+        <w:rPr>
+          <w:b/>
+        </w:rPr>
+        <w:t>Frontend:</w:t>
+      </w:r>
+      <w:r>
+        <w:t xml:space="preserve"> sin cambios de código. </w:t>
+      </w:r>
+      <w:r>
+        <w:rPr>
+          <w:rFonts w:ascii="Consolas" w:hAnsi="Consolas"/>
+          <w:sz w:val="18"/>
+        </w:rPr>
+        <w:t>casino/page.tsx</w:t>
+      </w:r>
+      <w:r>
+        <w:t xml:space="preserve"> muestra tal cual el mensaje del error de la RPC (</w:t>
+      </w:r>
+      <w:r>
+        <w:rPr>
+          <w:rFonts w:ascii="Consolas" w:hAnsi="Consolas"/>
+          <w:sz w:val="18"/>
+        </w:rPr>
+        <w:t>casinoErrorES</w:t>
+      </w:r>
+      <w:r>
+        <w:t xml:space="preserve"> → </w:t>
+      </w:r>
+      <w:r>
+        <w:rPr>
+          <w:rFonts w:ascii="Consolas" w:hAnsi="Consolas"/>
+          <w:sz w:val="18"/>
+        </w:rPr>
+        <w:t>errorES</w:t>
+      </w:r>
+      <w:r>
+        <w:t xml:space="preserve"> devuelve el texto desconocido sin cambiar). El botón "Comprar" no se oculta; al pulsarlo sale el mensaje.</w:t>
+      </w:r>
+    </w:p>
     <w:sectPr>
       <w:pgSz w:w="12240" w:h="15840"/>
       <w:pgMar w:top="1440" w:right="1800" w:bottom="1440" w:left="1800" w:header="720" w:footer="720" w:gutter="0"/>

</xml_diff>